<commit_message>
Showcase: describe what the system does, not how the pipeline works; drop pipeline-detail figures; fix thumbnail name
</commit_message>
<xml_diff>
--- a/docs/AVIRMATH_AI_Architecture.docx
+++ b/docs/AVIRMATH_AI_Architecture.docx
@@ -307,7 +307,7 @@
                 <w:rFonts w:ascii="Consolas" w:hAnsi="Consolas"/>
                 <w:sz w:val="17"/>
               </w:rPr>
-              <w:t>fig2_lesson_pipeline.*</w:t>
+              <w:t>fig3_single_source_of_truth.*</w:t>
             </w:r>
             <w:r>
               <w:rPr>
@@ -320,7 +320,7 @@
                 <w:rFonts w:ascii="Consolas" w:hAnsi="Consolas"/>
                 <w:sz w:val="17"/>
               </w:rPr>
-              <w:t>fig3_single_source_of_truth.*</w:t>
+              <w:t>architecture_ieee.*</w:t>
             </w:r>
             <w:r>
               <w:rPr>
@@ -759,7 +759,7 @@
               <w:rPr>
                 <w:sz w:val="17"/>
               </w:rPr>
-              <w:t>Narration, sync engine, renderer, assembly, SEO/AEO/GEO pack, site generator</w:t>
+              <w:t>Narration, renderer, assembly, SEO/AEO/GEO pack, site generator</w:t>
             </w:r>
           </w:p>
         </w:tc>
@@ -1234,7 +1234,7 @@
               <w:rPr>
                 <w:sz w:val="17"/>
               </w:rPr>
-              <w:t>Female British English voice chosen by the founder; speaking rate +10 to +12 %. Returns word-level timings used by the sync engine.</w:t>
+              <w:t>Female British English voice chosen by the founder; speaking rate +10 to +12 %.</w:t>
             </w:r>
           </w:p>
         </w:tc>
@@ -2176,7 +2176,7 @@
               <w:rPr>
                 <w:sz w:val="17"/>
               </w:rPr>
-              <w:t>Neural narration with word timings.</w:t>
+              <w:t>Neural narration.</w:t>
             </w:r>
           </w:p>
         </w:tc>
@@ -2241,7 +2241,7 @@
               <w:rPr>
                 <w:sz w:val="17"/>
               </w:rPr>
-              <w:t>Per-beat audio trimming and delay, loudness normalisation, muxing, captions, chapter metadata, logo overlay.</w:t>
+              <w:t>Video assembly, loudness normalisation, muxing, captions, chapter metadata, logo overlay.</w:t>
             </w:r>
           </w:p>
         </w:tc>
@@ -2306,7 +2306,7 @@
               <w:rPr>
                 <w:sz w:val="17"/>
               </w:rPr>
-              <w:t>Frame extraction for QA stills and poster images.</w:t>
+              <w:t>Poster images.</w:t>
             </w:r>
           </w:p>
         </w:tc>
@@ -2914,20 +2914,7 @@
               <w:rPr>
                 <w:sz w:val="17"/>
               </w:rPr>
-              <w:t>ui-ux-pro-max skill output (</w:t>
-            </w:r>
-            <w:r>
-              <w:rPr>
-                <w:rFonts w:ascii="Consolas" w:hAnsi="Consolas"/>
-                <w:sz w:val="17"/>
-              </w:rPr>
-              <w:t>design-system/avirmath-ai/MASTER.md</w:t>
-            </w:r>
-            <w:r>
-              <w:rPr>
-                <w:sz w:val="17"/>
-              </w:rPr>
-              <w:t>)</w:t>
+              <w:t>Project design tokens</w:t>
             </w:r>
           </w:p>
         </w:tc>
@@ -2963,291 +2950,11 @@
         <w:t>4.4 Authoring environment</w:t>
       </w:r>
     </w:p>
-    <w:tbl>
-      <w:tblPr>
-        <w:tblStyle w:val="TableGrid"/>
-        <w:tblW w:type="auto" w:w="0"/>
-        <w:jc w:val="center"/>
-        <w:tblLook w:firstColumn="1" w:firstRow="1" w:lastColumn="0" w:lastRow="0" w:noHBand="0" w:noVBand="1" w:val="04A0"/>
-      </w:tblPr>
-      <w:tblGrid>
-        <w:gridCol w:w="4873"/>
-        <w:gridCol w:w="4873"/>
-      </w:tblGrid>
-      <w:tr>
-        <w:tc>
-          <w:tcPr>
-            <w:tcW w:type="dxa" w:w="4873"/>
-            <w:shd w:val="clear" w:color="auto" w:fill="E5E7EB"/>
-          </w:tcPr>
-          <w:p>
-            <w:pPr>
-              <w:spacing w:after="20"/>
-            </w:pPr>
-            <w:r>
-              <w:rPr>
-                <w:b/>
-                <w:sz w:val="17"/>
-              </w:rPr>
-            </w:r>
-            <w:r>
-              <w:rPr>
-                <w:b/>
-                <w:sz w:val="17"/>
-              </w:rPr>
-              <w:t>Tool</w:t>
-            </w:r>
-          </w:p>
-        </w:tc>
-        <w:tc>
-          <w:tcPr>
-            <w:tcW w:type="dxa" w:w="4873"/>
-            <w:shd w:val="clear" w:color="auto" w:fill="E5E7EB"/>
-          </w:tcPr>
-          <w:p>
-            <w:pPr>
-              <w:spacing w:after="20"/>
-            </w:pPr>
-            <w:r>
-              <w:rPr>
-                <w:b/>
-                <w:sz w:val="17"/>
-              </w:rPr>
-            </w:r>
-            <w:r>
-              <w:rPr>
-                <w:b/>
-                <w:sz w:val="17"/>
-              </w:rPr>
-              <w:t>Role</w:t>
-            </w:r>
-          </w:p>
-        </w:tc>
-      </w:tr>
-      <w:tr>
-        <w:tc>
-          <w:tcPr>
-            <w:tcW w:type="dxa" w:w="4873"/>
-          </w:tcPr>
-          <w:p>
-            <w:pPr>
-              <w:spacing w:after="20"/>
-            </w:pPr>
-            <w:r>
-              <w:rPr>
-                <w:sz w:val="17"/>
-              </w:rPr>
-            </w:r>
-            <w:r>
-              <w:rPr>
-                <w:sz w:val="17"/>
-              </w:rPr>
-              <w:t>LLM agent runtime (desktop)</w:t>
-            </w:r>
-          </w:p>
-        </w:tc>
-        <w:tc>
-          <w:tcPr>
-            <w:tcW w:type="dxa" w:w="4873"/>
-          </w:tcPr>
-          <w:p>
-            <w:pPr>
-              <w:spacing w:after="20"/>
-            </w:pPr>
-            <w:r>
-              <w:rPr>
-                <w:sz w:val="17"/>
-              </w:rPr>
-            </w:r>
-            <w:r>
-              <w:rPr>
-                <w:sz w:val="17"/>
-              </w:rPr>
-              <w:t>File tools, shell, browser pane for visual QA, persistent project memory.</w:t>
-            </w:r>
-          </w:p>
-        </w:tc>
-      </w:tr>
-      <w:tr>
-        <w:tc>
-          <w:tcPr>
-            <w:tcW w:type="dxa" w:w="4873"/>
-          </w:tcPr>
-          <w:p>
-            <w:pPr>
-              <w:spacing w:after="20"/>
-            </w:pPr>
-            <w:r>
-              <w:rPr>
-                <w:sz w:val="17"/>
-              </w:rPr>
-            </w:r>
-            <w:r>
-              <w:rPr>
-                <w:rFonts w:ascii="Consolas" w:hAnsi="Consolas"/>
-                <w:sz w:val="17"/>
-              </w:rPr>
-              <w:t>avirmathai</w:t>
-            </w:r>
-            <w:r>
-              <w:rPr>
-                <w:sz w:val="17"/>
-              </w:rPr>
-              <w:t xml:space="preserve"> skill</w:t>
-            </w:r>
-          </w:p>
-        </w:tc>
-        <w:tc>
-          <w:tcPr>
-            <w:tcW w:type="dxa" w:w="4873"/>
-          </w:tcPr>
-          <w:p>
-            <w:pPr>
-              <w:spacing w:after="20"/>
-            </w:pPr>
-            <w:r>
-              <w:rPr>
-                <w:sz w:val="17"/>
-              </w:rPr>
-            </w:r>
-            <w:r>
-              <w:rPr>
-                <w:sz w:val="17"/>
-              </w:rPr>
-              <w:t>House rules the agents follow: approval before building, history-grounded stories, mathematician-grade examples, 3D for gradients, step-by-step working, British narration, per-learner profiles.</w:t>
-            </w:r>
-          </w:p>
-        </w:tc>
-      </w:tr>
-      <w:tr>
-        <w:tc>
-          <w:tcPr>
-            <w:tcW w:type="dxa" w:w="4873"/>
-          </w:tcPr>
-          <w:p>
-            <w:pPr>
-              <w:spacing w:after="20"/>
-            </w:pPr>
-            <w:r>
-              <w:rPr>
-                <w:sz w:val="17"/>
-              </w:rPr>
-            </w:r>
-            <w:r>
-              <w:rPr>
-                <w:sz w:val="17"/>
-              </w:rPr>
-              <w:t>Design skills (</w:t>
-            </w:r>
-            <w:r>
-              <w:rPr>
-                <w:rFonts w:ascii="Consolas" w:hAnsi="Consolas"/>
-                <w:sz w:val="17"/>
-              </w:rPr>
-              <w:t>ui-ux-pro-max</w:t>
-            </w:r>
-            <w:r>
-              <w:rPr>
-                <w:sz w:val="17"/>
-              </w:rPr>
-              <w:t xml:space="preserve">, </w:t>
-            </w:r>
-            <w:r>
-              <w:rPr>
-                <w:rFonts w:ascii="Consolas" w:hAnsi="Consolas"/>
-                <w:sz w:val="17"/>
-              </w:rPr>
-              <w:t>design-system</w:t>
-            </w:r>
-            <w:r>
-              <w:rPr>
-                <w:sz w:val="17"/>
-              </w:rPr>
-              <w:t xml:space="preserve">, </w:t>
-            </w:r>
-            <w:r>
-              <w:rPr>
-                <w:rFonts w:ascii="Consolas" w:hAnsi="Consolas"/>
-                <w:sz w:val="17"/>
-              </w:rPr>
-              <w:t>brand</w:t>
-            </w:r>
-            <w:r>
-              <w:rPr>
-                <w:sz w:val="17"/>
-              </w:rPr>
-              <w:t>)</w:t>
-            </w:r>
-          </w:p>
-        </w:tc>
-        <w:tc>
-          <w:tcPr>
-            <w:tcW w:type="dxa" w:w="4873"/>
-          </w:tcPr>
-          <w:p>
-            <w:pPr>
-              <w:spacing w:after="20"/>
-            </w:pPr>
-            <w:r>
-              <w:rPr>
-                <w:sz w:val="17"/>
-              </w:rPr>
-            </w:r>
-            <w:r>
-              <w:rPr>
-                <w:sz w:val="17"/>
-              </w:rPr>
-              <w:t>Design tokens and review checklists for the site and the logo.</w:t>
-            </w:r>
-          </w:p>
-        </w:tc>
-      </w:tr>
-      <w:tr>
-        <w:tc>
-          <w:tcPr>
-            <w:tcW w:type="dxa" w:w="4873"/>
-          </w:tcPr>
-          <w:p>
-            <w:pPr>
-              <w:spacing w:after="20"/>
-            </w:pPr>
-            <w:r>
-              <w:rPr>
-                <w:sz w:val="17"/>
-              </w:rPr>
-            </w:r>
-            <w:r>
-              <w:rPr>
-                <w:sz w:val="17"/>
-              </w:rPr>
-              <w:t>Wikipedia and primary sources</w:t>
-            </w:r>
-          </w:p>
-        </w:tc>
-        <w:tc>
-          <w:tcPr>
-            <w:tcW w:type="dxa" w:w="4873"/>
-          </w:tcPr>
-          <w:p>
-            <w:pPr>
-              <w:spacing w:after="20"/>
-            </w:pPr>
-            <w:r>
-              <w:rPr>
-                <w:sz w:val="17"/>
-              </w:rPr>
-            </w:r>
-            <w:r>
-              <w:rPr>
-                <w:sz w:val="17"/>
-              </w:rPr>
-              <w:t>Historian's source check for people, dates and industry claims.</w:t>
-            </w:r>
-          </w:p>
-        </w:tc>
-      </w:tr>
-    </w:tbl>
-    <w:p/>
+    <w:p>
+      <w:r>
+        <w:t>The agent roles run inside an LLM agent runtime (file tools, shell, browser for visual checks) and follow a written set of house rules covering pedagogy, visual style and production standards. The rules are part of the private pipeline. The Historian role checks people, dates and industry claims against primary sources.</w:t>
+      </w:r>
+    </w:p>
     <w:p>
       <w:pPr>
         <w:pStyle w:val="Heading1"/>
@@ -3258,7 +2965,7 @@
     </w:p>
     <w:p>
       <w:r>
-        <w:t>One orchestrator and eight specialised agents. Each agent is a role with a fixed input artifact, a fixed output artifact, a restricted tool set, and a gate it must pass. Agents never share a conversation; they hand each other files through the shared store (Figure 1, layer E).</w:t>
+        <w:t>One orchestrator and eight specialised agent roles. Each role owns one artifact and must pass a gate before its work is accepted. Roles never share a conversation; they hand each other files.</w:t>
       </w:r>
     </w:p>
     <w:tbl>
@@ -3269,17 +2976,14 @@
         <w:tblLook w:firstColumn="1" w:firstRow="1" w:lastColumn="0" w:lastRow="0" w:noHBand="0" w:noVBand="1" w:val="04A0"/>
       </w:tblPr>
       <w:tblGrid>
-        <w:gridCol w:w="1624"/>
-        <w:gridCol w:w="1624"/>
-        <w:gridCol w:w="1624"/>
-        <w:gridCol w:w="1624"/>
-        <w:gridCol w:w="1624"/>
-        <w:gridCol w:w="1624"/>
+        <w:gridCol w:w="3249"/>
+        <w:gridCol w:w="3249"/>
+        <w:gridCol w:w="3249"/>
       </w:tblGrid>
       <w:tr>
         <w:tc>
           <w:tcPr>
-            <w:tcW w:type="dxa" w:w="1624"/>
+            <w:tcW w:type="dxa" w:w="3249"/>
             <w:shd w:val="clear" w:color="auto" w:fill="E5E7EB"/>
           </w:tcPr>
           <w:p>
@@ -3303,7 +3007,7 @@
         </w:tc>
         <w:tc>
           <w:tcPr>
-            <w:tcW w:type="dxa" w:w="1624"/>
+            <w:tcW w:type="dxa" w:w="3249"/>
             <w:shd w:val="clear" w:color="auto" w:fill="E5E7EB"/>
           </w:tcPr>
           <w:p>
@@ -3321,13 +3025,13 @@
                 <w:b/>
                 <w:sz w:val="17"/>
               </w:rPr>
-              <w:t>Agent</w:t>
+              <w:t>Role</w:t>
             </w:r>
           </w:p>
         </w:tc>
         <w:tc>
           <w:tcPr>
-            <w:tcW w:type="dxa" w:w="1624"/>
+            <w:tcW w:type="dxa" w:w="3249"/>
             <w:shd w:val="clear" w:color="auto" w:fill="E5E7EB"/>
           </w:tcPr>
           <w:p>
@@ -3345,79 +3049,7 @@
                 <w:b/>
                 <w:sz w:val="17"/>
               </w:rPr>
-              <w:t>Input</w:t>
-            </w:r>
-          </w:p>
-        </w:tc>
-        <w:tc>
-          <w:tcPr>
-            <w:tcW w:type="dxa" w:w="1624"/>
-            <w:shd w:val="clear" w:color="auto" w:fill="E5E7EB"/>
-          </w:tcPr>
-          <w:p>
-            <w:pPr>
-              <w:spacing w:after="20"/>
-            </w:pPr>
-            <w:r>
-              <w:rPr>
-                <w:b/>
-                <w:sz w:val="17"/>
-              </w:rPr>
-            </w:r>
-            <w:r>
-              <w:rPr>
-                <w:b/>
-                <w:sz w:val="17"/>
-              </w:rPr>
-              <w:t>Output (artifact it owns)</w:t>
-            </w:r>
-          </w:p>
-        </w:tc>
-        <w:tc>
-          <w:tcPr>
-            <w:tcW w:type="dxa" w:w="1624"/>
-            <w:shd w:val="clear" w:color="auto" w:fill="E5E7EB"/>
-          </w:tcPr>
-          <w:p>
-            <w:pPr>
-              <w:spacing w:after="20"/>
-            </w:pPr>
-            <w:r>
-              <w:rPr>
-                <w:b/>
-                <w:sz w:val="17"/>
-              </w:rPr>
-            </w:r>
-            <w:r>
-              <w:rPr>
-                <w:b/>
-                <w:sz w:val="17"/>
-              </w:rPr>
-              <w:t>Tools it may use</w:t>
-            </w:r>
-          </w:p>
-        </w:tc>
-        <w:tc>
-          <w:tcPr>
-            <w:tcW w:type="dxa" w:w="1624"/>
-            <w:shd w:val="clear" w:color="auto" w:fill="E5E7EB"/>
-          </w:tcPr>
-          <w:p>
-            <w:pPr>
-              <w:spacing w:after="20"/>
-            </w:pPr>
-            <w:r>
-              <w:rPr>
-                <w:b/>
-                <w:sz w:val="17"/>
-              </w:rPr>
-            </w:r>
-            <w:r>
-              <w:rPr>
-                <w:b/>
-                <w:sz w:val="17"/>
-              </w:rPr>
-              <w:t>Gate before its output is accepted</w:t>
+              <w:t>Owns</w:t>
             </w:r>
           </w:p>
         </w:tc>
@@ -3425,7 +3057,7 @@
       <w:tr>
         <w:tc>
           <w:tcPr>
-            <w:tcW w:type="dxa" w:w="1624"/>
+            <w:tcW w:type="dxa" w:w="3249"/>
           </w:tcPr>
           <w:p>
             <w:pPr>
@@ -3446,7 +3078,7 @@
         </w:tc>
         <w:tc>
           <w:tcPr>
-            <w:tcW w:type="dxa" w:w="1624"/>
+            <w:tcW w:type="dxa" w:w="3249"/>
           </w:tcPr>
           <w:p>
             <w:pPr>
@@ -3468,13 +3100,13 @@
               <w:rPr>
                 <w:sz w:val="17"/>
               </w:rPr>
-              <w:t xml:space="preserve"> (“Lesson Director”)</w:t>
+              <w:t xml:space="preserve"> ("Lesson Director")</w:t>
             </w:r>
           </w:p>
         </w:tc>
         <w:tc>
           <w:tcPr>
-            <w:tcW w:type="dxa" w:w="1624"/>
+            <w:tcW w:type="dxa" w:w="3249"/>
           </w:tcPr>
           <w:p>
             <w:pPr>
@@ -3489,70 +3121,7 @@
               <w:rPr>
                 <w:sz w:val="17"/>
               </w:rPr>
-              <w:t>Learner request: topic, level, field, own question</w:t>
-            </w:r>
-          </w:p>
-        </w:tc>
-        <w:tc>
-          <w:tcPr>
-            <w:tcW w:type="dxa" w:w="1624"/>
-          </w:tcPr>
-          <w:p>
-            <w:pPr>
-              <w:spacing w:after="20"/>
-            </w:pPr>
-            <w:r>
-              <w:rPr>
-                <w:sz w:val="17"/>
-              </w:rPr>
-            </w:r>
-            <w:r>
-              <w:rPr>
-                <w:sz w:val="17"/>
-              </w:rPr>
-              <w:t>Job record, routing decisions, retry counts, approval requests</w:t>
-            </w:r>
-          </w:p>
-        </w:tc>
-        <w:tc>
-          <w:tcPr>
-            <w:tcW w:type="dxa" w:w="1624"/>
-          </w:tcPr>
-          <w:p>
-            <w:pPr>
-              <w:spacing w:after="20"/>
-            </w:pPr>
-            <w:r>
-              <w:rPr>
-                <w:sz w:val="17"/>
-              </w:rPr>
-            </w:r>
-            <w:r>
-              <w:rPr>
-                <w:sz w:val="17"/>
-              </w:rPr>
-              <w:t>Job state store, queue, gate results, budget meter, approval inbox. Never writes content.</w:t>
-            </w:r>
-          </w:p>
-        </w:tc>
-        <w:tc>
-          <w:tcPr>
-            <w:tcW w:type="dxa" w:w="1624"/>
-          </w:tcPr>
-          <w:p>
-            <w:pPr>
-              <w:spacing w:after="20"/>
-            </w:pPr>
-            <w:r>
-              <w:rPr>
-                <w:sz w:val="17"/>
-              </w:rPr>
-            </w:r>
-            <w:r>
-              <w:rPr>
-                <w:sz w:val="17"/>
-              </w:rPr>
-              <w:t>—</w:t>
+              <w:t>The job: routing, retries, approval requests. Never writes content.</w:t>
             </w:r>
           </w:p>
         </w:tc>
@@ -3560,7 +3129,7 @@
       <w:tr>
         <w:tc>
           <w:tcPr>
-            <w:tcW w:type="dxa" w:w="1624"/>
+            <w:tcW w:type="dxa" w:w="3249"/>
           </w:tcPr>
           <w:p>
             <w:pPr>
@@ -3581,7 +3150,7 @@
         </w:tc>
         <w:tc>
           <w:tcPr>
-            <w:tcW w:type="dxa" w:w="1624"/>
+            <w:tcW w:type="dxa" w:w="3249"/>
           </w:tcPr>
           <w:p>
             <w:pPr>
@@ -3603,7 +3172,7 @@
         </w:tc>
         <w:tc>
           <w:tcPr>
-            <w:tcW w:type="dxa" w:w="1624"/>
+            <w:tcW w:type="dxa" w:w="3249"/>
           </w:tcPr>
           <w:p>
             <w:pPr>
@@ -3618,83 +3187,7 @@
               <w:rPr>
                 <w:sz w:val="17"/>
               </w:rPr>
-              <w:t>Learner request, concept graph, catalogue</w:t>
-            </w:r>
-          </w:p>
-        </w:tc>
-        <w:tc>
-          <w:tcPr>
-            <w:tcW w:type="dxa" w:w="1624"/>
-          </w:tcPr>
-          <w:p>
-            <w:pPr>
-              <w:spacing w:after="20"/>
-            </w:pPr>
-            <w:r>
-              <w:rPr>
-                <w:sz w:val="17"/>
-              </w:rPr>
-            </w:r>
-            <w:r>
-              <w:rPr>
-                <w:sz w:val="17"/>
-              </w:rPr>
-              <w:t>Learning objectives and prerequisite ladder</w:t>
-            </w:r>
-          </w:p>
-        </w:tc>
-        <w:tc>
-          <w:tcPr>
-            <w:tcW w:type="dxa" w:w="1624"/>
-          </w:tcPr>
-          <w:p>
-            <w:pPr>
-              <w:spacing w:after="20"/>
-            </w:pPr>
-            <w:r>
-              <w:rPr>
-                <w:sz w:val="17"/>
-              </w:rPr>
-            </w:r>
-            <w:r>
-              <w:rPr>
-                <w:sz w:val="17"/>
-              </w:rPr>
-              <w:t>Concept graph, catalogue (</w:t>
-            </w:r>
-            <w:r>
-              <w:rPr>
-                <w:rFonts w:ascii="Consolas" w:hAnsi="Consolas"/>
-                <w:sz w:val="17"/>
-              </w:rPr>
-              <w:t>lessons/CATALOG.md</w:t>
-            </w:r>
-            <w:r>
-              <w:rPr>
-                <w:sz w:val="17"/>
-              </w:rPr>
-              <w:t>), learner-profile store</w:t>
-            </w:r>
-          </w:p>
-        </w:tc>
-        <w:tc>
-          <w:tcPr>
-            <w:tcW w:type="dxa" w:w="1624"/>
-          </w:tcPr>
-          <w:p>
-            <w:pPr>
-              <w:spacing w:after="20"/>
-            </w:pPr>
-            <w:r>
-              <w:rPr>
-                <w:sz w:val="17"/>
-              </w:rPr>
-            </w:r>
-            <w:r>
-              <w:rPr>
-                <w:sz w:val="17"/>
-              </w:rPr>
-              <w:t>Objectives reference catalogue concepts only</w:t>
+              <w:t>Learning objectives and the prerequisite ladder for the learner's level and field.</w:t>
             </w:r>
           </w:p>
         </w:tc>
@@ -3702,7 +3195,7 @@
       <w:tr>
         <w:tc>
           <w:tcPr>
-            <w:tcW w:type="dxa" w:w="1624"/>
+            <w:tcW w:type="dxa" w:w="3249"/>
           </w:tcPr>
           <w:p>
             <w:pPr>
@@ -3723,7 +3216,7 @@
         </w:tc>
         <w:tc>
           <w:tcPr>
-            <w:tcW w:type="dxa" w:w="1624"/>
+            <w:tcW w:type="dxa" w:w="3249"/>
           </w:tcPr>
           <w:p>
             <w:pPr>
@@ -3745,7 +3238,7 @@
         </w:tc>
         <w:tc>
           <w:tcPr>
-            <w:tcW w:type="dxa" w:w="1624"/>
+            <w:tcW w:type="dxa" w:w="3249"/>
           </w:tcPr>
           <w:p>
             <w:pPr>
@@ -3760,70 +3253,7 @@
               <w:rPr>
                 <w:sz w:val="17"/>
               </w:rPr>
-              <w:t>Objectives</w:t>
-            </w:r>
-          </w:p>
-        </w:tc>
-        <w:tc>
-          <w:tcPr>
-            <w:tcW w:type="dxa" w:w="1624"/>
-          </w:tcPr>
-          <w:p>
-            <w:pPr>
-              <w:spacing w:after="20"/>
-            </w:pPr>
-            <w:r>
-              <w:rPr>
-                <w:sz w:val="17"/>
-              </w:rPr>
-            </w:r>
-            <w:r>
-              <w:rPr>
-                <w:sz w:val="17"/>
-              </w:rPr>
-              <w:t>Origin story, dated events, real industry use, with sources</w:t>
-            </w:r>
-          </w:p>
-        </w:tc>
-        <w:tc>
-          <w:tcPr>
-            <w:tcW w:type="dxa" w:w="1624"/>
-          </w:tcPr>
-          <w:p>
-            <w:pPr>
-              <w:spacing w:after="20"/>
-            </w:pPr>
-            <w:r>
-              <w:rPr>
-                <w:sz w:val="17"/>
-              </w:rPr>
-            </w:r>
-            <w:r>
-              <w:rPr>
-                <w:sz w:val="17"/>
-              </w:rPr>
-              <w:t>Web search, page fetch, citation store</w:t>
-            </w:r>
-          </w:p>
-        </w:tc>
-        <w:tc>
-          <w:tcPr>
-            <w:tcW w:type="dxa" w:w="1624"/>
-          </w:tcPr>
-          <w:p>
-            <w:pPr>
-              <w:spacing w:after="20"/>
-            </w:pPr>
-            <w:r>
-              <w:rPr>
-                <w:sz w:val="17"/>
-              </w:rPr>
-            </w:r>
-            <w:r>
-              <w:rPr>
-                <w:sz w:val="17"/>
-              </w:rPr>
-              <w:t>Every claim has a source; dates cross-checked</w:t>
+              <w:t>Real-world uses and sources for every claim.</w:t>
             </w:r>
           </w:p>
         </w:tc>
@@ -3831,7 +3261,7 @@
       <w:tr>
         <w:tc>
           <w:tcPr>
-            <w:tcW w:type="dxa" w:w="1624"/>
+            <w:tcW w:type="dxa" w:w="3249"/>
           </w:tcPr>
           <w:p>
             <w:pPr>
@@ -3852,7 +3282,7 @@
         </w:tc>
         <w:tc>
           <w:tcPr>
-            <w:tcW w:type="dxa" w:w="1624"/>
+            <w:tcW w:type="dxa" w:w="3249"/>
           </w:tcPr>
           <w:p>
             <w:pPr>
@@ -3874,7 +3304,7 @@
         </w:tc>
         <w:tc>
           <w:tcPr>
-            <w:tcW w:type="dxa" w:w="1624"/>
+            <w:tcW w:type="dxa" w:w="3249"/>
           </w:tcPr>
           <w:p>
             <w:pPr>
@@ -3889,90 +3319,7 @@
               <w:rPr>
                 <w:sz w:val="17"/>
               </w:rPr>
-              <w:t>Objectives</w:t>
-            </w:r>
-          </w:p>
-        </w:tc>
-        <w:tc>
-          <w:tcPr>
-            <w:tcW w:type="dxa" w:w="1624"/>
-          </w:tcPr>
-          <w:p>
-            <w:pPr>
-              <w:spacing w:after="20"/>
-            </w:pPr>
-            <w:r>
-              <w:rPr>
-                <w:sz w:val="17"/>
-              </w:rPr>
-            </w:r>
-            <w:r>
-              <w:rPr>
-                <w:rFonts w:ascii="Consolas" w:hAnsi="Consolas"/>
-                <w:sz w:val="17"/>
-              </w:rPr>
-              <w:t>mathcore/&lt;concept&gt;.py</w:t>
-            </w:r>
-            <w:r>
-              <w:rPr>
-                <w:sz w:val="17"/>
-              </w:rPr>
-              <w:t xml:space="preserve"> with a </w:t>
-            </w:r>
-            <w:r>
-              <w:rPr>
-                <w:rFonts w:ascii="Consolas" w:hAnsi="Consolas"/>
-                <w:sz w:val="17"/>
-              </w:rPr>
-              <w:t>lesson_facts()</w:t>
-            </w:r>
-            <w:r>
-              <w:rPr>
-                <w:sz w:val="17"/>
-              </w:rPr>
-              <w:t xml:space="preserve"> dictionary</w:t>
-            </w:r>
-          </w:p>
-        </w:tc>
-        <w:tc>
-          <w:tcPr>
-            <w:tcW w:type="dxa" w:w="1624"/>
-          </w:tcPr>
-          <w:p>
-            <w:pPr>
-              <w:spacing w:after="20"/>
-            </w:pPr>
-            <w:r>
-              <w:rPr>
-                <w:sz w:val="17"/>
-              </w:rPr>
-            </w:r>
-            <w:r>
-              <w:rPr>
-                <w:sz w:val="17"/>
-              </w:rPr>
-              <w:t>Python sandbox, NumPy, SymPy</w:t>
-            </w:r>
-          </w:p>
-        </w:tc>
-        <w:tc>
-          <w:tcPr>
-            <w:tcW w:type="dxa" w:w="1624"/>
-          </w:tcPr>
-          <w:p>
-            <w:pPr>
-              <w:spacing w:after="20"/>
-            </w:pPr>
-            <w:r>
-              <w:rPr>
-                <w:sz w:val="17"/>
-              </w:rPr>
-            </w:r>
-            <w:r>
-              <w:rPr>
-                <w:sz w:val="17"/>
-              </w:rPr>
-              <w:t>Hands over to the Verifier; cannot self-approve</w:t>
+              <w:t>The mathematics as runnable code, with the facts a lesson may quote.</w:t>
             </w:r>
           </w:p>
         </w:tc>
@@ -3980,7 +3327,7 @@
       <w:tr>
         <w:tc>
           <w:tcPr>
-            <w:tcW w:type="dxa" w:w="1624"/>
+            <w:tcW w:type="dxa" w:w="3249"/>
           </w:tcPr>
           <w:p>
             <w:pPr>
@@ -4001,7 +3348,7 @@
         </w:tc>
         <w:tc>
           <w:tcPr>
-            <w:tcW w:type="dxa" w:w="1624"/>
+            <w:tcW w:type="dxa" w:w="3249"/>
           </w:tcPr>
           <w:p>
             <w:pPr>
@@ -4023,7 +3370,7 @@
         </w:tc>
         <w:tc>
           <w:tcPr>
-            <w:tcW w:type="dxa" w:w="1624"/>
+            <w:tcW w:type="dxa" w:w="3249"/>
           </w:tcPr>
           <w:p>
             <w:pPr>
@@ -4038,77 +3385,7 @@
               <w:rPr>
                 <w:sz w:val="17"/>
               </w:rPr>
-              <w:t>The Math Author's code only (never its reasoning)</w:t>
-            </w:r>
-          </w:p>
-        </w:tc>
-        <w:tc>
-          <w:tcPr>
-            <w:tcW w:type="dxa" w:w="1624"/>
-          </w:tcPr>
-          <w:p>
-            <w:pPr>
-              <w:spacing w:after="20"/>
-            </w:pPr>
-            <w:r>
-              <w:rPr>
-                <w:sz w:val="17"/>
-              </w:rPr>
-            </w:r>
-            <w:r>
-              <w:rPr>
-                <w:rFonts w:ascii="Consolas" w:hAnsi="Consolas"/>
-                <w:sz w:val="17"/>
-              </w:rPr>
-              <w:t>tests/test_&lt;concept&gt;.py</w:t>
-            </w:r>
-            <w:r>
-              <w:rPr>
-                <w:sz w:val="17"/>
-              </w:rPr>
-              <w:t>; pass/fail report</w:t>
-            </w:r>
-          </w:p>
-        </w:tc>
-        <w:tc>
-          <w:tcPr>
-            <w:tcW w:type="dxa" w:w="1624"/>
-          </w:tcPr>
-          <w:p>
-            <w:pPr>
-              <w:spacing w:after="20"/>
-            </w:pPr>
-            <w:r>
-              <w:rPr>
-                <w:sz w:val="17"/>
-              </w:rPr>
-            </w:r>
-            <w:r>
-              <w:rPr>
-                <w:sz w:val="17"/>
-              </w:rPr>
-              <w:t>pytest, SymPy symbolic differentiation, finite-difference gradient checker</w:t>
-            </w:r>
-          </w:p>
-        </w:tc>
-        <w:tc>
-          <w:tcPr>
-            <w:tcW w:type="dxa" w:w="1624"/>
-          </w:tcPr>
-          <w:p>
-            <w:pPr>
-              <w:spacing w:after="20"/>
-            </w:pPr>
-            <w:r>
-              <w:rPr>
-                <w:sz w:val="17"/>
-              </w:rPr>
-            </w:r>
-            <w:r>
-              <w:rPr>
-                <w:sz w:val="17"/>
-              </w:rPr>
-              <w:t>All tests pass (125 today)</w:t>
+              <w:t>The tests that try to break that code (125 today).</w:t>
             </w:r>
           </w:p>
         </w:tc>
@@ -4116,7 +3393,7 @@
       <w:tr>
         <w:tc>
           <w:tcPr>
-            <w:tcW w:type="dxa" w:w="1624"/>
+            <w:tcW w:type="dxa" w:w="3249"/>
           </w:tcPr>
           <w:p>
             <w:pPr>
@@ -4137,7 +3414,7 @@
         </w:tc>
         <w:tc>
           <w:tcPr>
-            <w:tcW w:type="dxa" w:w="1624"/>
+            <w:tcW w:type="dxa" w:w="3249"/>
           </w:tcPr>
           <w:p>
             <w:pPr>
@@ -4159,7 +3436,7 @@
         </w:tc>
         <w:tc>
           <w:tcPr>
-            <w:tcW w:type="dxa" w:w="1624"/>
+            <w:tcW w:type="dxa" w:w="3249"/>
           </w:tcPr>
           <w:p>
             <w:pPr>
@@ -4172,27 +3449,6 @@
             </w:r>
             <w:r>
               <w:rPr>
-                <w:sz w:val="17"/>
-              </w:rPr>
-              <w:t>Story, facts dictionary, objectives</w:t>
-            </w:r>
-          </w:p>
-        </w:tc>
-        <w:tc>
-          <w:tcPr>
-            <w:tcW w:type="dxa" w:w="1624"/>
-          </w:tcPr>
-          <w:p>
-            <w:pPr>
-              <w:spacing w:after="20"/>
-            </w:pPr>
-            <w:r>
-              <w:rPr>
-                <w:sz w:val="17"/>
-              </w:rPr>
-            </w:r>
-            <w:r>
-              <w:rPr>
                 <w:rFonts w:ascii="Consolas" w:hAnsi="Consolas"/>
                 <w:sz w:val="17"/>
               </w:rPr>
@@ -4202,88 +3458,7 @@
               <w:rPr>
                 <w:sz w:val="17"/>
               </w:rPr>
-              <w:t>: chapters, beats, narration, equations, animation cues, quiz, SEO/AEO/GEO block</w:t>
-            </w:r>
-          </w:p>
-        </w:tc>
-        <w:tc>
-          <w:tcPr>
-            <w:tcW w:type="dxa" w:w="1624"/>
-          </w:tcPr>
-          <w:p>
-            <w:pPr>
-              <w:spacing w:after="20"/>
-            </w:pPr>
-            <w:r>
-              <w:rPr>
-                <w:sz w:val="17"/>
-              </w:rPr>
-            </w:r>
-            <w:r>
-              <w:rPr>
-                <w:sz w:val="17"/>
-              </w:rPr>
-              <w:t xml:space="preserve">Lesson schema validator, facts dictionary, </w:t>
-            </w:r>
-            <w:r>
-              <w:rPr>
-                <w:rFonts w:ascii="Consolas" w:hAnsi="Consolas"/>
-                <w:sz w:val="17"/>
-              </w:rPr>
-              <w:t>avirmathai</w:t>
-            </w:r>
-            <w:r>
-              <w:rPr>
-                <w:sz w:val="17"/>
-              </w:rPr>
-              <w:t xml:space="preserve"> skill</w:t>
-            </w:r>
-          </w:p>
-        </w:tc>
-        <w:tc>
-          <w:tcPr>
-            <w:tcW w:type="dxa" w:w="1624"/>
-          </w:tcPr>
-          <w:p>
-            <w:pPr>
-              <w:spacing w:after="20"/>
-            </w:pPr>
-            <w:r>
-              <w:rPr>
-                <w:sz w:val="17"/>
-              </w:rPr>
-            </w:r>
-            <w:r>
-              <w:rPr>
-                <w:sz w:val="17"/>
-              </w:rPr>
-              <w:t xml:space="preserve">Schema valid; every </w:t>
-            </w:r>
-            <w:r>
-              <w:rPr>
-                <w:rFonts w:ascii="Consolas" w:hAnsi="Consolas"/>
-                <w:sz w:val="17"/>
-              </w:rPr>
-              <w:t>{placeholder}</w:t>
-            </w:r>
-            <w:r>
-              <w:rPr>
-                <w:sz w:val="17"/>
-              </w:rPr>
-              <w:t xml:space="preserve"> resolves to a fact; every equation names a </w:t>
-            </w:r>
-            <w:r>
-              <w:rPr>
-                <w:rFonts w:ascii="Consolas" w:hAnsi="Consolas"/>
-                <w:sz w:val="17"/>
-              </w:rPr>
-              <w:t>checked_by</w:t>
-            </w:r>
-            <w:r>
-              <w:rPr>
-                <w:sz w:val="17"/>
-              </w:rPr>
-              <w:t xml:space="preserve"> test that exists; founder approves the storyboard</w:t>
+              <w:t>: chapters, narration, equations, quiz, SEO/AEO/GEO block.</w:t>
             </w:r>
           </w:p>
         </w:tc>
@@ -4291,7 +3466,7 @@
       <w:tr>
         <w:tc>
           <w:tcPr>
-            <w:tcW w:type="dxa" w:w="1624"/>
+            <w:tcW w:type="dxa" w:w="3249"/>
           </w:tcPr>
           <w:p>
             <w:pPr>
@@ -4312,7 +3487,7 @@
         </w:tc>
         <w:tc>
           <w:tcPr>
-            <w:tcW w:type="dxa" w:w="1624"/>
+            <w:tcW w:type="dxa" w:w="3249"/>
           </w:tcPr>
           <w:p>
             <w:pPr>
@@ -4334,7 +3509,7 @@
         </w:tc>
         <w:tc>
           <w:tcPr>
-            <w:tcW w:type="dxa" w:w="1624"/>
+            <w:tcW w:type="dxa" w:w="3249"/>
           </w:tcPr>
           <w:p>
             <w:pPr>
@@ -4347,105 +3522,9 @@
             </w:r>
             <w:r>
               <w:rPr>
-                <w:rFonts w:ascii="Consolas" w:hAnsi="Consolas"/>
-                <w:sz w:val="17"/>
-              </w:rPr>
-              <w:t>lesson.yaml</w:t>
-            </w:r>
-            <w:r>
-              <w:rPr>
-                <w:sz w:val="17"/>
-              </w:rPr>
-              <w:t xml:space="preserve"> cues, word timings</w:t>
-            </w:r>
-          </w:p>
-        </w:tc>
-        <w:tc>
-          <w:tcPr>
-            <w:tcW w:type="dxa" w:w="1624"/>
-          </w:tcPr>
-          <w:p>
-            <w:pPr>
-              <w:spacing w:after="20"/>
-            </w:pPr>
-            <w:r>
-              <w:rPr>
-                <w:sz w:val="17"/>
-              </w:rPr>
-            </w:r>
-            <w:r>
-              <w:rPr>
-                <w:sz w:val="17"/>
-              </w:rPr>
-              <w:t>Manim scene classes (</w:t>
-            </w:r>
-            <w:r>
-              <w:rPr>
-                <w:rFonts w:ascii="Consolas" w:hAnsi="Consolas"/>
-                <w:sz w:val="17"/>
-              </w:rPr>
-              <w:t>video/scenes/&lt;id&gt;.py</w:t>
-            </w:r>
-            <w:r>
-              <w:rPr>
-                <w:sz w:val="17"/>
-              </w:rPr>
-              <w:t>)</w:t>
-            </w:r>
-          </w:p>
-        </w:tc>
-        <w:tc>
-          <w:tcPr>
-            <w:tcW w:type="dxa" w:w="1624"/>
-          </w:tcPr>
-          <w:p>
-            <w:pPr>
-              <w:spacing w:after="20"/>
-            </w:pPr>
-            <w:r>
-              <w:rPr>
-                <w:sz w:val="17"/>
-              </w:rPr>
-            </w:r>
-            <w:r>
-              <w:rPr>
-                <w:sz w:val="17"/>
-              </w:rPr>
-              <w:t>Manim, style module, scene library, snapshot renderer (</w:t>
-            </w:r>
-            <w:r>
-              <w:rPr>
-                <w:rFonts w:ascii="Consolas" w:hAnsi="Consolas"/>
-                <w:sz w:val="17"/>
-              </w:rPr>
-              <w:t>--snap</w:t>
-            </w:r>
-            <w:r>
-              <w:rPr>
-                <w:sz w:val="17"/>
-              </w:rPr>
-              <w:t>)</w:t>
-            </w:r>
-          </w:p>
-        </w:tc>
-        <w:tc>
-          <w:tcPr>
-            <w:tcW w:type="dxa" w:w="1624"/>
-          </w:tcPr>
-          <w:p>
-            <w:pPr>
-              <w:spacing w:after="20"/>
-            </w:pPr>
-            <w:r>
-              <w:rPr>
-                <w:sz w:val="17"/>
-              </w:rPr>
-            </w:r>
-            <w:r>
-              <w:rPr>
-                <w:sz w:val="17"/>
-              </w:rPr>
-              <w:t>Every beat ends within its narrated window (no overrun)</w:t>
+                <w:sz w:val="17"/>
+              </w:rPr>
+              <w:t>The animated scenes for each chapter.</w:t>
             </w:r>
           </w:p>
         </w:tc>
@@ -4453,7 +3532,7 @@
       <w:tr>
         <w:tc>
           <w:tcPr>
-            <w:tcW w:type="dxa" w:w="1624"/>
+            <w:tcW w:type="dxa" w:w="3249"/>
           </w:tcPr>
           <w:p>
             <w:pPr>
@@ -4474,7 +3553,7 @@
         </w:tc>
         <w:tc>
           <w:tcPr>
-            <w:tcW w:type="dxa" w:w="1624"/>
+            <w:tcW w:type="dxa" w:w="3249"/>
           </w:tcPr>
           <w:p>
             <w:pPr>
@@ -4496,7 +3575,7 @@
         </w:tc>
         <w:tc>
           <w:tcPr>
-            <w:tcW w:type="dxa" w:w="1624"/>
+            <w:tcW w:type="dxa" w:w="3249"/>
           </w:tcPr>
           <w:p>
             <w:pPr>
@@ -4511,70 +3590,7 @@
               <w:rPr>
                 <w:sz w:val="17"/>
               </w:rPr>
-              <w:t>One still per beat</w:t>
-            </w:r>
-          </w:p>
-        </w:tc>
-        <w:tc>
-          <w:tcPr>
-            <w:tcW w:type="dxa" w:w="1624"/>
-          </w:tcPr>
-          <w:p>
-            <w:pPr>
-              <w:spacing w:after="20"/>
-            </w:pPr>
-            <w:r>
-              <w:rPr>
-                <w:sz w:val="17"/>
-              </w:rPr>
-            </w:r>
-            <w:r>
-              <w:rPr>
-                <w:sz w:val="17"/>
-              </w:rPr>
-              <w:t>Defect list or clean report</w:t>
-            </w:r>
-          </w:p>
-        </w:tc>
-        <w:tc>
-          <w:tcPr>
-            <w:tcW w:type="dxa" w:w="1624"/>
-          </w:tcPr>
-          <w:p>
-            <w:pPr>
-              <w:spacing w:after="20"/>
-            </w:pPr>
-            <w:r>
-              <w:rPr>
-                <w:sz w:val="17"/>
-              </w:rPr>
-            </w:r>
-            <w:r>
-              <w:rPr>
-                <w:sz w:val="17"/>
-              </w:rPr>
-              <w:t>Frame sampler, image input (“watch it muted”)</w:t>
-            </w:r>
-          </w:p>
-        </w:tc>
-        <w:tc>
-          <w:tcPr>
-            <w:tcW w:type="dxa" w:w="1624"/>
-          </w:tcPr>
-          <w:p>
-            <w:pPr>
-              <w:spacing w:after="20"/>
-            </w:pPr>
-            <w:r>
-              <w:rPr>
-                <w:sz w:val="17"/>
-              </w:rPr>
-            </w:r>
-            <w:r>
-              <w:rPr>
-                <w:sz w:val="17"/>
-              </w:rPr>
-              <w:t>No overlaps, clipping, off-palette colours, or logo-corner intrusions</w:t>
+              <w:t>The frame-by-frame review of the rendered scenes.</w:t>
             </w:r>
           </w:p>
         </w:tc>
@@ -4582,7 +3598,7 @@
       <w:tr>
         <w:tc>
           <w:tcPr>
-            <w:tcW w:type="dxa" w:w="1624"/>
+            <w:tcW w:type="dxa" w:w="3249"/>
           </w:tcPr>
           <w:p>
             <w:pPr>
@@ -4603,7 +3619,7 @@
         </w:tc>
         <w:tc>
           <w:tcPr>
-            <w:tcW w:type="dxa" w:w="1624"/>
+            <w:tcW w:type="dxa" w:w="3249"/>
           </w:tcPr>
           <w:p>
             <w:pPr>
@@ -4625,7 +3641,7 @@
         </w:tc>
         <w:tc>
           <w:tcPr>
-            <w:tcW w:type="dxa" w:w="1624"/>
+            <w:tcW w:type="dxa" w:w="3249"/>
           </w:tcPr>
           <w:p>
             <w:pPr>
@@ -4638,79 +3654,9 @@
             </w:r>
             <w:r>
               <w:rPr>
-                <w:rFonts w:ascii="Consolas" w:hAnsi="Consolas"/>
-                <w:sz w:val="17"/>
-              </w:rPr>
-              <w:t>lesson.yaml</w:t>
-            </w:r>
-            <w:r>
-              <w:rPr>
-                <w:sz w:val="17"/>
-              </w:rPr>
-              <w:t xml:space="preserve"> experiment spec, mathcore</w:t>
-            </w:r>
-          </w:p>
-        </w:tc>
-        <w:tc>
-          <w:tcPr>
-            <w:tcW w:type="dxa" w:w="1624"/>
-          </w:tcPr>
-          <w:p>
-            <w:pPr>
-              <w:spacing w:after="20"/>
-            </w:pPr>
-            <w:r>
-              <w:rPr>
-                <w:sz w:val="17"/>
-              </w:rPr>
-            </w:r>
-            <w:r>
-              <w:rPr>
-                <w:sz w:val="17"/>
-              </w:rPr>
-              <w:t>Browser simulation (Three.js) and golden data</w:t>
-            </w:r>
-          </w:p>
-        </w:tc>
-        <w:tc>
-          <w:tcPr>
-            <w:tcW w:type="dxa" w:w="1624"/>
-          </w:tcPr>
-          <w:p>
-            <w:pPr>
-              <w:spacing w:after="20"/>
-            </w:pPr>
-            <w:r>
-              <w:rPr>
-                <w:sz w:val="17"/>
-              </w:rPr>
-            </w:r>
-            <w:r>
-              <w:rPr>
-                <w:sz w:val="17"/>
-              </w:rPr>
-              <w:t>Reference-data exporter from mathcore, test runner</w:t>
-            </w:r>
-          </w:p>
-        </w:tc>
-        <w:tc>
-          <w:tcPr>
-            <w:tcW w:type="dxa" w:w="1624"/>
-          </w:tcPr>
-          <w:p>
-            <w:pPr>
-              <w:spacing w:after="20"/>
-            </w:pPr>
-            <w:r>
-              <w:rPr>
-                <w:sz w:val="17"/>
-              </w:rPr>
-            </w:r>
-            <w:r>
-              <w:rPr>
-                <w:sz w:val="17"/>
-              </w:rPr>
-              <w:t>Simulation reproduces mathcore numbers within tolerance</w:t>
+                <w:sz w:val="17"/>
+              </w:rPr>
+              <w:t>The interactive experiment, checked against the same mathematics.</w:t>
             </w:r>
           </w:p>
         </w:tc>
@@ -4725,7 +3671,7 @@
         <w:t>Independence is the point.</w:t>
       </w:r>
       <w:r>
-        <w:t xml:space="preserve"> The Verifier and the Critic catch errors precisely because they did not produce the work they check. Least privilege applies: only the Historian reaches the web, only the mathematics agents execute code, and only the orchestrator can publish.</w:t>
+        <w:t xml:space="preserve"> The Verifier and the Critic catch errors precisely because they did not produce the work they check.</w:t>
       </w:r>
     </w:p>
     <w:p>
@@ -4737,1248 +3683,8 @@
       </w:r>
     </w:p>
     <w:p>
-      <w:pPr>
-        <w:jc w:val="center"/>
-      </w:pPr>
       <w:r>
-        <w:drawing>
-          <wp:inline xmlns:a="http://schemas.openxmlformats.org/drawingml/2006/main" xmlns:pic="http://schemas.openxmlformats.org/drawingml/2006/picture">
-            <wp:extent cx="5940000" cy="3136187"/>
-            <wp:docPr id="2" name="Picture 2"/>
-            <wp:cNvGraphicFramePr>
-              <a:graphicFrameLocks noChangeAspect="1"/>
-            </wp:cNvGraphicFramePr>
-            <a:graphic>
-              <a:graphicData uri="http://schemas.openxmlformats.org/drawingml/2006/picture">
-                <pic:pic>
-                  <pic:nvPicPr>
-                    <pic:cNvPr id="0" name="fig2_lesson_pipeline.png"/>
-                    <pic:cNvPicPr/>
-                  </pic:nvPicPr>
-                  <pic:blipFill>
-                    <a:blip r:embed="rId10"/>
-                    <a:stretch>
-                      <a:fillRect/>
-                    </a:stretch>
-                  </pic:blipFill>
-                  <pic:spPr>
-                    <a:xfrm>
-                      <a:off x="0" y="0"/>
-                      <a:ext cx="5940000" cy="3136187"/>
-                    </a:xfrm>
-                    <a:prstGeom prst="rect"/>
-                  </pic:spPr>
-                </pic:pic>
-              </a:graphicData>
-            </a:graphic>
-          </wp:inline>
-        </w:drawing>
-      </w:r>
-    </w:p>
-    <w:p>
-      <w:pPr>
-        <w:jc w:val="center"/>
-      </w:pPr>
-      <w:r>
-        <w:rPr>
-          <w:i/>
-          <w:sz w:val="18"/>
-        </w:rPr>
-        <w:t>Figure 2. The nine-stage pipeline as run for the six foundation lessons. Blue stages are agent work, orange are verification and control, green are deterministic services. Dashed red arrows are bounded feedback loops. H marks the single human checkpoint.</w:t>
-      </w:r>
-    </w:p>
-    <w:p>
-      <w:pPr>
-        <w:pStyle w:val="Heading2"/>
-      </w:pPr>
-      <w:r>
-        <w:t>6.1 Job state machine</w:t>
-      </w:r>
-    </w:p>
-    <w:p>
-      <w:r>
-        <w:t>A lesson job moves through nine states. The orchestrator advances a job only when the stage's gate reports success.</w:t>
-      </w:r>
-    </w:p>
-    <w:tbl>
-      <w:tblPr>
-        <w:tblStyle w:val="TableGrid"/>
-        <w:tblW w:type="auto" w:w="0"/>
-        <w:jc w:val="center"/>
-        <w:tblLook w:firstColumn="1" w:firstRow="1" w:lastColumn="0" w:lastRow="0" w:noHBand="0" w:noVBand="1" w:val="04A0"/>
-      </w:tblPr>
-      <w:tblGrid>
-        <w:gridCol w:w="2436"/>
-        <w:gridCol w:w="2436"/>
-        <w:gridCol w:w="2436"/>
-        <w:gridCol w:w="2436"/>
-      </w:tblGrid>
-      <w:tr>
-        <w:tc>
-          <w:tcPr>
-            <w:tcW w:type="dxa" w:w="2436"/>
-            <w:shd w:val="clear" w:color="auto" w:fill="E5E7EB"/>
-          </w:tcPr>
-          <w:p>
-            <w:pPr>
-              <w:spacing w:after="20"/>
-            </w:pPr>
-            <w:r>
-              <w:rPr>
-                <w:b/>
-                <w:sz w:val="17"/>
-              </w:rPr>
-            </w:r>
-            <w:r>
-              <w:rPr>
-                <w:b/>
-                <w:sz w:val="17"/>
-              </w:rPr>
-              <w:t>Stage</w:t>
-            </w:r>
-          </w:p>
-        </w:tc>
-        <w:tc>
-          <w:tcPr>
-            <w:tcW w:type="dxa" w:w="2436"/>
-            <w:shd w:val="clear" w:color="auto" w:fill="E5E7EB"/>
-          </w:tcPr>
-          <w:p>
-            <w:pPr>
-              <w:spacing w:after="20"/>
-            </w:pPr>
-            <w:r>
-              <w:rPr>
-                <w:b/>
-                <w:sz w:val="17"/>
-              </w:rPr>
-            </w:r>
-            <w:r>
-              <w:rPr>
-                <w:b/>
-                <w:sz w:val="17"/>
-              </w:rPr>
-              <w:t>Who</w:t>
-            </w:r>
-          </w:p>
-        </w:tc>
-        <w:tc>
-          <w:tcPr>
-            <w:tcW w:type="dxa" w:w="2436"/>
-            <w:shd w:val="clear" w:color="auto" w:fill="E5E7EB"/>
-          </w:tcPr>
-          <w:p>
-            <w:pPr>
-              <w:spacing w:after="20"/>
-            </w:pPr>
-            <w:r>
-              <w:rPr>
-                <w:b/>
-                <w:sz w:val="17"/>
-              </w:rPr>
-            </w:r>
-            <w:r>
-              <w:rPr>
-                <w:b/>
-                <w:sz w:val="17"/>
-              </w:rPr>
-              <w:t>Gate</w:t>
-            </w:r>
-          </w:p>
-        </w:tc>
-        <w:tc>
-          <w:tcPr>
-            <w:tcW w:type="dxa" w:w="2436"/>
-            <w:shd w:val="clear" w:color="auto" w:fill="E5E7EB"/>
-          </w:tcPr>
-          <w:p>
-            <w:pPr>
-              <w:spacing w:after="20"/>
-            </w:pPr>
-            <w:r>
-              <w:rPr>
-                <w:b/>
-                <w:sz w:val="17"/>
-              </w:rPr>
-            </w:r>
-            <w:r>
-              <w:rPr>
-                <w:b/>
-                <w:sz w:val="17"/>
-              </w:rPr>
-              <w:t>On failure</w:t>
-            </w:r>
-          </w:p>
-        </w:tc>
-      </w:tr>
-      <w:tr>
-        <w:tc>
-          <w:tcPr>
-            <w:tcW w:type="dxa" w:w="2436"/>
-          </w:tcPr>
-          <w:p>
-            <w:pPr>
-              <w:spacing w:after="20"/>
-            </w:pPr>
-            <w:r>
-              <w:rPr>
-                <w:sz w:val="17"/>
-              </w:rPr>
-            </w:r>
-            <w:r>
-              <w:rPr>
-                <w:sz w:val="17"/>
-              </w:rPr>
-              <w:t>1 Research</w:t>
-            </w:r>
-          </w:p>
-        </w:tc>
-        <w:tc>
-          <w:tcPr>
-            <w:tcW w:type="dxa" w:w="2436"/>
-          </w:tcPr>
-          <w:p>
-            <w:pPr>
-              <w:spacing w:after="20"/>
-            </w:pPr>
-            <w:r>
-              <w:rPr>
-                <w:sz w:val="17"/>
-              </w:rPr>
-            </w:r>
-            <w:r>
-              <w:rPr>
-                <w:sz w:val="17"/>
-              </w:rPr>
-              <w:t>Historian</w:t>
-            </w:r>
-          </w:p>
-        </w:tc>
-        <w:tc>
-          <w:tcPr>
-            <w:tcW w:type="dxa" w:w="2436"/>
-          </w:tcPr>
-          <w:p>
-            <w:pPr>
-              <w:spacing w:after="20"/>
-            </w:pPr>
-            <w:r>
-              <w:rPr>
-                <w:sz w:val="17"/>
-              </w:rPr>
-            </w:r>
-            <w:r>
-              <w:rPr>
-                <w:sz w:val="17"/>
-              </w:rPr>
-              <w:t>Sources present and consistent</w:t>
-            </w:r>
-          </w:p>
-        </w:tc>
-        <w:tc>
-          <w:tcPr>
-            <w:tcW w:type="dxa" w:w="2436"/>
-          </w:tcPr>
-          <w:p>
-            <w:pPr>
-              <w:spacing w:after="20"/>
-            </w:pPr>
-            <w:r>
-              <w:rPr>
-                <w:sz w:val="17"/>
-              </w:rPr>
-            </w:r>
-            <w:r>
-              <w:rPr>
-                <w:sz w:val="17"/>
-              </w:rPr>
-              <w:t>Re-research, max 3 attempts</w:t>
-            </w:r>
-          </w:p>
-        </w:tc>
-      </w:tr>
-      <w:tr>
-        <w:tc>
-          <w:tcPr>
-            <w:tcW w:type="dxa" w:w="2436"/>
-          </w:tcPr>
-          <w:p>
-            <w:pPr>
-              <w:spacing w:after="20"/>
-            </w:pPr>
-            <w:r>
-              <w:rPr>
-                <w:sz w:val="17"/>
-              </w:rPr>
-            </w:r>
-            <w:r>
-              <w:rPr>
-                <w:sz w:val="17"/>
-              </w:rPr>
-              <w:t>2 Mathematics</w:t>
-            </w:r>
-          </w:p>
-        </w:tc>
-        <w:tc>
-          <w:tcPr>
-            <w:tcW w:type="dxa" w:w="2436"/>
-          </w:tcPr>
-          <w:p>
-            <w:pPr>
-              <w:spacing w:after="20"/>
-            </w:pPr>
-            <w:r>
-              <w:rPr>
-                <w:sz w:val="17"/>
-              </w:rPr>
-            </w:r>
-            <w:r>
-              <w:rPr>
-                <w:sz w:val="17"/>
-              </w:rPr>
-              <w:t>Math Author</w:t>
-            </w:r>
-          </w:p>
-        </w:tc>
-        <w:tc>
-          <w:tcPr>
-            <w:tcW w:type="dxa" w:w="2436"/>
-          </w:tcPr>
-          <w:p>
-            <w:pPr>
-              <w:spacing w:after="20"/>
-            </w:pPr>
-            <w:r>
-              <w:rPr>
-                <w:sz w:val="17"/>
-              </w:rPr>
-            </w:r>
-            <w:r>
-              <w:rPr>
-                <w:sz w:val="17"/>
-              </w:rPr>
-              <w:t>— (hands to 3)</w:t>
-            </w:r>
-          </w:p>
-        </w:tc>
-        <w:tc>
-          <w:tcPr>
-            <w:tcW w:type="dxa" w:w="2436"/>
-          </w:tcPr>
-          <w:p>
-            <w:pPr>
-              <w:spacing w:after="20"/>
-            </w:pPr>
-            <w:r>
-              <w:rPr>
-                <w:sz w:val="17"/>
-              </w:rPr>
-            </w:r>
-            <w:r>
-              <w:rPr>
-                <w:sz w:val="17"/>
-              </w:rPr>
-              <w:t>—</w:t>
-            </w:r>
-          </w:p>
-        </w:tc>
-      </w:tr>
-      <w:tr>
-        <w:tc>
-          <w:tcPr>
-            <w:tcW w:type="dxa" w:w="2436"/>
-          </w:tcPr>
-          <w:p>
-            <w:pPr>
-              <w:spacing w:after="20"/>
-            </w:pPr>
-            <w:r>
-              <w:rPr>
-                <w:sz w:val="17"/>
-              </w:rPr>
-            </w:r>
-            <w:r>
-              <w:rPr>
-                <w:sz w:val="17"/>
-              </w:rPr>
-              <w:t>3 Verification</w:t>
-            </w:r>
-          </w:p>
-        </w:tc>
-        <w:tc>
-          <w:tcPr>
-            <w:tcW w:type="dxa" w:w="2436"/>
-          </w:tcPr>
-          <w:p>
-            <w:pPr>
-              <w:spacing w:after="20"/>
-            </w:pPr>
-            <w:r>
-              <w:rPr>
-                <w:sz w:val="17"/>
-              </w:rPr>
-            </w:r>
-            <w:r>
-              <w:rPr>
-                <w:sz w:val="17"/>
-              </w:rPr>
-              <w:t>Math Verifier</w:t>
-            </w:r>
-          </w:p>
-        </w:tc>
-        <w:tc>
-          <w:tcPr>
-            <w:tcW w:type="dxa" w:w="2436"/>
-          </w:tcPr>
-          <w:p>
-            <w:pPr>
-              <w:spacing w:after="20"/>
-            </w:pPr>
-            <w:r>
-              <w:rPr>
-                <w:sz w:val="17"/>
-              </w:rPr>
-            </w:r>
-            <w:r>
-              <w:rPr>
-                <w:rFonts w:ascii="Consolas" w:hAnsi="Consolas"/>
-                <w:sz w:val="17"/>
-              </w:rPr>
-              <w:t>pytest</w:t>
-            </w:r>
-            <w:r>
-              <w:rPr>
-                <w:sz w:val="17"/>
-              </w:rPr>
-              <w:t xml:space="preserve"> all green</w:t>
-            </w:r>
-          </w:p>
-        </w:tc>
-        <w:tc>
-          <w:tcPr>
-            <w:tcW w:type="dxa" w:w="2436"/>
-          </w:tcPr>
-          <w:p>
-            <w:pPr>
-              <w:spacing w:after="20"/>
-            </w:pPr>
-            <w:r>
-              <w:rPr>
-                <w:sz w:val="17"/>
-              </w:rPr>
-            </w:r>
-            <w:r>
-              <w:rPr>
-                <w:sz w:val="17"/>
-              </w:rPr>
-              <w:t>Exact failing assertion returned to the Math Author; max 3 attempts</w:t>
-            </w:r>
-          </w:p>
-        </w:tc>
-      </w:tr>
-      <w:tr>
-        <w:tc>
-          <w:tcPr>
-            <w:tcW w:type="dxa" w:w="2436"/>
-          </w:tcPr>
-          <w:p>
-            <w:pPr>
-              <w:spacing w:after="20"/>
-            </w:pPr>
-            <w:r>
-              <w:rPr>
-                <w:sz w:val="17"/>
-              </w:rPr>
-            </w:r>
-            <w:r>
-              <w:rPr>
-                <w:sz w:val="17"/>
-              </w:rPr>
-              <w:t>4 Composition</w:t>
-            </w:r>
-          </w:p>
-        </w:tc>
-        <w:tc>
-          <w:tcPr>
-            <w:tcW w:type="dxa" w:w="2436"/>
-          </w:tcPr>
-          <w:p>
-            <w:pPr>
-              <w:spacing w:after="20"/>
-            </w:pPr>
-            <w:r>
-              <w:rPr>
-                <w:sz w:val="17"/>
-              </w:rPr>
-            </w:r>
-            <w:r>
-              <w:rPr>
-                <w:sz w:val="17"/>
-              </w:rPr>
-              <w:t>Lesson Writer</w:t>
-            </w:r>
-          </w:p>
-        </w:tc>
-        <w:tc>
-          <w:tcPr>
-            <w:tcW w:type="dxa" w:w="2436"/>
-          </w:tcPr>
-          <w:p>
-            <w:pPr>
-              <w:spacing w:after="20"/>
-            </w:pPr>
-            <w:r>
-              <w:rPr>
-                <w:sz w:val="17"/>
-              </w:rPr>
-            </w:r>
-            <w:r>
-              <w:rPr>
-                <w:sz w:val="17"/>
-              </w:rPr>
-              <w:t xml:space="preserve">Schema valid, facts resolved, </w:t>
-            </w:r>
-            <w:r>
-              <w:rPr>
-                <w:rFonts w:ascii="Consolas" w:hAnsi="Consolas"/>
-                <w:sz w:val="17"/>
-              </w:rPr>
-              <w:t>checked_by</w:t>
-            </w:r>
-            <w:r>
-              <w:rPr>
-                <w:sz w:val="17"/>
-              </w:rPr>
-              <w:t xml:space="preserve"> tests exist</w:t>
-            </w:r>
-          </w:p>
-        </w:tc>
-        <w:tc>
-          <w:tcPr>
-            <w:tcW w:type="dxa" w:w="2436"/>
-          </w:tcPr>
-          <w:p>
-            <w:pPr>
-              <w:spacing w:after="20"/>
-            </w:pPr>
-            <w:r>
-              <w:rPr>
-                <w:sz w:val="17"/>
-              </w:rPr>
-            </w:r>
-            <w:r>
-              <w:rPr>
-                <w:sz w:val="17"/>
-              </w:rPr>
-              <w:t>Validator message returned to the Writer</w:t>
-            </w:r>
-          </w:p>
-        </w:tc>
-      </w:tr>
-      <w:tr>
-        <w:tc>
-          <w:tcPr>
-            <w:tcW w:type="dxa" w:w="2436"/>
-          </w:tcPr>
-          <w:p>
-            <w:pPr>
-              <w:spacing w:after="20"/>
-            </w:pPr>
-            <w:r>
-              <w:rPr>
-                <w:sz w:val="17"/>
-              </w:rPr>
-            </w:r>
-            <w:r>
-              <w:rPr>
-                <w:b/>
-                <w:sz w:val="17"/>
-              </w:rPr>
-              <w:t>H</w:t>
-            </w:r>
-            <w:r>
-              <w:rPr>
-                <w:sz w:val="17"/>
-              </w:rPr>
-              <w:t xml:space="preserve"> Storyboard approval</w:t>
-            </w:r>
-          </w:p>
-        </w:tc>
-        <w:tc>
-          <w:tcPr>
-            <w:tcW w:type="dxa" w:w="2436"/>
-          </w:tcPr>
-          <w:p>
-            <w:pPr>
-              <w:spacing w:after="20"/>
-            </w:pPr>
-            <w:r>
-              <w:rPr>
-                <w:sz w:val="17"/>
-              </w:rPr>
-            </w:r>
-            <w:r>
-              <w:rPr>
-                <w:sz w:val="17"/>
-              </w:rPr>
-              <w:t>Founder</w:t>
-            </w:r>
-          </w:p>
-        </w:tc>
-        <w:tc>
-          <w:tcPr>
-            <w:tcW w:type="dxa" w:w="2436"/>
-          </w:tcPr>
-          <w:p>
-            <w:pPr>
-              <w:spacing w:after="20"/>
-            </w:pPr>
-            <w:r>
-              <w:rPr>
-                <w:sz w:val="17"/>
-              </w:rPr>
-            </w:r>
-            <w:r>
-              <w:rPr>
-                <w:sz w:val="17"/>
-              </w:rPr>
-              <w:t>Approved</w:t>
-            </w:r>
-          </w:p>
-        </w:tc>
-        <w:tc>
-          <w:tcPr>
-            <w:tcW w:type="dxa" w:w="2436"/>
-          </w:tcPr>
-          <w:p>
-            <w:pPr>
-              <w:spacing w:after="20"/>
-            </w:pPr>
-            <w:r>
-              <w:rPr>
-                <w:sz w:val="17"/>
-              </w:rPr>
-            </w:r>
-            <w:r>
-              <w:rPr>
-                <w:sz w:val="17"/>
-              </w:rPr>
-              <w:t>Writer revises; job waits</w:t>
-            </w:r>
-          </w:p>
-        </w:tc>
-      </w:tr>
-      <w:tr>
-        <w:tc>
-          <w:tcPr>
-            <w:tcW w:type="dxa" w:w="2436"/>
-          </w:tcPr>
-          <w:p>
-            <w:pPr>
-              <w:spacing w:after="20"/>
-            </w:pPr>
-            <w:r>
-              <w:rPr>
-                <w:sz w:val="17"/>
-              </w:rPr>
-            </w:r>
-            <w:r>
-              <w:rPr>
-                <w:sz w:val="17"/>
-              </w:rPr>
-              <w:t>5 Narration</w:t>
-            </w:r>
-          </w:p>
-        </w:tc>
-        <w:tc>
-          <w:tcPr>
-            <w:tcW w:type="dxa" w:w="2436"/>
-          </w:tcPr>
-          <w:p>
-            <w:pPr>
-              <w:spacing w:after="20"/>
-            </w:pPr>
-            <w:r>
-              <w:rPr>
-                <w:sz w:val="17"/>
-              </w:rPr>
-            </w:r>
-            <w:r>
-              <w:rPr>
-                <w:sz w:val="17"/>
-              </w:rPr>
-              <w:t>Service</w:t>
-            </w:r>
-          </w:p>
-        </w:tc>
-        <w:tc>
-          <w:tcPr>
-            <w:tcW w:type="dxa" w:w="2436"/>
-          </w:tcPr>
-          <w:p>
-            <w:pPr>
-              <w:spacing w:after="20"/>
-            </w:pPr>
-            <w:r>
-              <w:rPr>
-                <w:sz w:val="17"/>
-              </w:rPr>
-            </w:r>
-            <w:r>
-              <w:rPr>
-                <w:sz w:val="17"/>
-              </w:rPr>
-              <w:t xml:space="preserve">Audio and </w:t>
-            </w:r>
-            <w:r>
-              <w:rPr>
-                <w:rFonts w:ascii="Consolas" w:hAnsi="Consolas"/>
-                <w:sz w:val="17"/>
-              </w:rPr>
-              <w:t>timings.json</w:t>
-            </w:r>
-            <w:r>
-              <w:rPr>
-                <w:sz w:val="17"/>
-              </w:rPr>
-              <w:t xml:space="preserve"> produced for every chapter</w:t>
-            </w:r>
-          </w:p>
-        </w:tc>
-        <w:tc>
-          <w:tcPr>
-            <w:tcW w:type="dxa" w:w="2436"/>
-          </w:tcPr>
-          <w:p>
-            <w:pPr>
-              <w:spacing w:after="20"/>
-            </w:pPr>
-            <w:r>
-              <w:rPr>
-                <w:sz w:val="17"/>
-              </w:rPr>
-            </w:r>
-            <w:r>
-              <w:rPr>
-                <w:sz w:val="17"/>
-              </w:rPr>
-              <w:t>Service error → stop</w:t>
-            </w:r>
-          </w:p>
-        </w:tc>
-      </w:tr>
-      <w:tr>
-        <w:tc>
-          <w:tcPr>
-            <w:tcW w:type="dxa" w:w="2436"/>
-          </w:tcPr>
-          <w:p>
-            <w:pPr>
-              <w:spacing w:after="20"/>
-            </w:pPr>
-            <w:r>
-              <w:rPr>
-                <w:sz w:val="17"/>
-              </w:rPr>
-            </w:r>
-            <w:r>
-              <w:rPr>
-                <w:sz w:val="17"/>
-              </w:rPr>
-              <w:t>6 Animation</w:t>
-            </w:r>
-          </w:p>
-        </w:tc>
-        <w:tc>
-          <w:tcPr>
-            <w:tcW w:type="dxa" w:w="2436"/>
-          </w:tcPr>
-          <w:p>
-            <w:pPr>
-              <w:spacing w:after="20"/>
-            </w:pPr>
-            <w:r>
-              <w:rPr>
-                <w:sz w:val="17"/>
-              </w:rPr>
-            </w:r>
-            <w:r>
-              <w:rPr>
-                <w:sz w:val="17"/>
-              </w:rPr>
-              <w:t>Animation Director</w:t>
-            </w:r>
-          </w:p>
-        </w:tc>
-        <w:tc>
-          <w:tcPr>
-            <w:tcW w:type="dxa" w:w="2436"/>
-          </w:tcPr>
-          <w:p>
-            <w:pPr>
-              <w:spacing w:after="20"/>
-            </w:pPr>
-            <w:r>
-              <w:rPr>
-                <w:sz w:val="17"/>
-              </w:rPr>
-            </w:r>
-            <w:r>
-              <w:rPr>
-                <w:sz w:val="17"/>
-              </w:rPr>
-              <w:t xml:space="preserve">Each beat's </w:t>
-            </w:r>
-            <w:r>
-              <w:rPr>
-                <w:rFonts w:ascii="Consolas" w:hAnsi="Consolas"/>
-                <w:sz w:val="17"/>
-              </w:rPr>
-              <w:t>actual/&lt;Scene&gt;.json</w:t>
-            </w:r>
-            <w:r>
-              <w:rPr>
-                <w:sz w:val="17"/>
-              </w:rPr>
-              <w:t xml:space="preserve"> within its narrated window</w:t>
-            </w:r>
-          </w:p>
-        </w:tc>
-        <w:tc>
-          <w:tcPr>
-            <w:tcW w:type="dxa" w:w="2436"/>
-          </w:tcPr>
-          <w:p>
-            <w:pPr>
-              <w:spacing w:after="20"/>
-            </w:pPr>
-            <w:r>
-              <w:rPr>
-                <w:sz w:val="17"/>
-              </w:rPr>
-            </w:r>
-            <w:r>
-              <w:rPr>
-                <w:sz w:val="17"/>
-              </w:rPr>
-              <w:t>Overrun report returned to the Director</w:t>
-            </w:r>
-          </w:p>
-        </w:tc>
-      </w:tr>
-      <w:tr>
-        <w:tc>
-          <w:tcPr>
-            <w:tcW w:type="dxa" w:w="2436"/>
-          </w:tcPr>
-          <w:p>
-            <w:pPr>
-              <w:spacing w:after="20"/>
-            </w:pPr>
-            <w:r>
-              <w:rPr>
-                <w:sz w:val="17"/>
-              </w:rPr>
-            </w:r>
-            <w:r>
-              <w:rPr>
-                <w:sz w:val="17"/>
-              </w:rPr>
-              <w:t>7 Visual QA</w:t>
-            </w:r>
-          </w:p>
-        </w:tc>
-        <w:tc>
-          <w:tcPr>
-            <w:tcW w:type="dxa" w:w="2436"/>
-          </w:tcPr>
-          <w:p>
-            <w:pPr>
-              <w:spacing w:after="20"/>
-            </w:pPr>
-            <w:r>
-              <w:rPr>
-                <w:sz w:val="17"/>
-              </w:rPr>
-            </w:r>
-            <w:r>
-              <w:rPr>
-                <w:sz w:val="17"/>
-              </w:rPr>
-              <w:t>Visual Critic</w:t>
-            </w:r>
-          </w:p>
-        </w:tc>
-        <w:tc>
-          <w:tcPr>
-            <w:tcW w:type="dxa" w:w="2436"/>
-          </w:tcPr>
-          <w:p>
-            <w:pPr>
-              <w:spacing w:after="20"/>
-            </w:pPr>
-            <w:r>
-              <w:rPr>
-                <w:sz w:val="17"/>
-              </w:rPr>
-            </w:r>
-            <w:r>
-              <w:rPr>
-                <w:sz w:val="17"/>
-              </w:rPr>
-              <w:t>No defects in any beat still</w:t>
-            </w:r>
-          </w:p>
-        </w:tc>
-        <w:tc>
-          <w:tcPr>
-            <w:tcW w:type="dxa" w:w="2436"/>
-          </w:tcPr>
-          <w:p>
-            <w:pPr>
-              <w:spacing w:after="20"/>
-            </w:pPr>
-            <w:r>
-              <w:rPr>
-                <w:sz w:val="17"/>
-              </w:rPr>
-            </w:r>
-            <w:r>
-              <w:rPr>
-                <w:sz w:val="17"/>
-              </w:rPr>
-              <w:t>Defect list returned to the Director; re-snapshot</w:t>
-            </w:r>
-          </w:p>
-        </w:tc>
-      </w:tr>
-      <w:tr>
-        <w:tc>
-          <w:tcPr>
-            <w:tcW w:type="dxa" w:w="2436"/>
-          </w:tcPr>
-          <w:p>
-            <w:pPr>
-              <w:spacing w:after="20"/>
-            </w:pPr>
-            <w:r>
-              <w:rPr>
-                <w:sz w:val="17"/>
-              </w:rPr>
-            </w:r>
-            <w:r>
-              <w:rPr>
-                <w:sz w:val="17"/>
-              </w:rPr>
-              <w:t>8 Render and assemble</w:t>
-            </w:r>
-          </w:p>
-        </w:tc>
-        <w:tc>
-          <w:tcPr>
-            <w:tcW w:type="dxa" w:w="2436"/>
-          </w:tcPr>
-          <w:p>
-            <w:pPr>
-              <w:spacing w:after="20"/>
-            </w:pPr>
-            <w:r>
-              <w:rPr>
-                <w:sz w:val="17"/>
-              </w:rPr>
-            </w:r>
-            <w:r>
-              <w:rPr>
-                <w:sz w:val="17"/>
-              </w:rPr>
-              <w:t>Service</w:t>
-            </w:r>
-          </w:p>
-        </w:tc>
-        <w:tc>
-          <w:tcPr>
-            <w:tcW w:type="dxa" w:w="2436"/>
-          </w:tcPr>
-          <w:p>
-            <w:pPr>
-              <w:spacing w:after="20"/>
-            </w:pPr>
-            <w:r>
-              <w:rPr>
-                <w:sz w:val="17"/>
-              </w:rPr>
-            </w:r>
-            <w:r>
-              <w:rPr>
-                <w:sz w:val="17"/>
-              </w:rPr>
-              <w:t>Output file exists, duration matches narration</w:t>
-            </w:r>
-          </w:p>
-        </w:tc>
-        <w:tc>
-          <w:tcPr>
-            <w:tcW w:type="dxa" w:w="2436"/>
-          </w:tcPr>
-          <w:p>
-            <w:pPr>
-              <w:spacing w:after="20"/>
-            </w:pPr>
-            <w:r>
-              <w:rPr>
-                <w:sz w:val="17"/>
-              </w:rPr>
-            </w:r>
-            <w:r>
-              <w:rPr>
-                <w:sz w:val="17"/>
-              </w:rPr>
-              <w:t>Service error → stop</w:t>
-            </w:r>
-          </w:p>
-        </w:tc>
-      </w:tr>
-      <w:tr>
-        <w:tc>
-          <w:tcPr>
-            <w:tcW w:type="dxa" w:w="2436"/>
-          </w:tcPr>
-          <w:p>
-            <w:pPr>
-              <w:spacing w:after="20"/>
-            </w:pPr>
-            <w:r>
-              <w:rPr>
-                <w:sz w:val="17"/>
-              </w:rPr>
-            </w:r>
-            <w:r>
-              <w:rPr>
-                <w:sz w:val="17"/>
-              </w:rPr>
-              <w:t>9 Publish</w:t>
-            </w:r>
-          </w:p>
-        </w:tc>
-        <w:tc>
-          <w:tcPr>
-            <w:tcW w:type="dxa" w:w="2436"/>
-          </w:tcPr>
-          <w:p>
-            <w:pPr>
-              <w:spacing w:after="20"/>
-            </w:pPr>
-            <w:r>
-              <w:rPr>
-                <w:sz w:val="17"/>
-              </w:rPr>
-            </w:r>
-            <w:r>
-              <w:rPr>
-                <w:sz w:val="17"/>
-              </w:rPr>
-              <w:t>Service</w:t>
-            </w:r>
-          </w:p>
-        </w:tc>
-        <w:tc>
-          <w:tcPr>
-            <w:tcW w:type="dxa" w:w="2436"/>
-          </w:tcPr>
-          <w:p>
-            <w:pPr>
-              <w:spacing w:after="20"/>
-            </w:pPr>
-            <w:r>
-              <w:rPr>
-                <w:sz w:val="17"/>
-              </w:rPr>
-            </w:r>
-            <w:r>
-              <w:rPr>
-                <w:sz w:val="17"/>
-              </w:rPr>
-              <w:t>Site builds, page has video, captions, poster</w:t>
-            </w:r>
-          </w:p>
-        </w:tc>
-        <w:tc>
-          <w:tcPr>
-            <w:tcW w:type="dxa" w:w="2436"/>
-          </w:tcPr>
-          <w:p>
-            <w:pPr>
-              <w:spacing w:after="20"/>
-            </w:pPr>
-            <w:r>
-              <w:rPr>
-                <w:sz w:val="17"/>
-              </w:rPr>
-            </w:r>
-            <w:r>
-              <w:rPr>
-                <w:sz w:val="17"/>
-              </w:rPr>
-              <w:t>Service error → stop</w:t>
-            </w:r>
-          </w:p>
-        </w:tc>
-      </w:tr>
-    </w:tbl>
-    <w:p/>
-    <w:p>
-      <w:pPr>
-        <w:pStyle w:val="Heading2"/>
-      </w:pPr>
-      <w:r>
-        <w:t>6.2 Control rules</w:t>
-      </w:r>
-    </w:p>
-    <w:p>
-      <w:pPr>
-        <w:pStyle w:val="ListNumber"/>
-      </w:pPr>
-      <w:r>
-        <w:rPr>
-          <w:b/>
-        </w:rPr>
-        <w:t>Order and parallelism.</w:t>
-      </w:r>
-      <w:r>
-        <w:t xml:space="preserve"> The Historian and the Math Author run concurrently; the Lesson Writer waits for both. The Experiment Builder runs in parallel with the Animation Director once the storyboard is approved.</w:t>
-      </w:r>
-    </w:p>
-    <w:p>
-      <w:pPr>
-        <w:pStyle w:val="ListNumber"/>
-      </w:pPr>
-      <w:r>
-        <w:rPr>
-          <w:b/>
-        </w:rPr>
-        <w:t>Hard gates.</w:t>
-      </w:r>
-      <w:r>
-        <w:t xml:space="preserve"> No agent can overrule a gate. The gates are deterministic programs, so a passing lesson is reproducible.</w:t>
-      </w:r>
-    </w:p>
-    <w:p>
-      <w:pPr>
-        <w:pStyle w:val="ListNumber"/>
-      </w:pPr>
-      <w:r>
-        <w:rPr>
-          <w:b/>
-        </w:rPr>
-        <w:t>Bounded feedback loops.</w:t>
-      </w:r>
-      <w:r>
-        <w:t xml:space="preserve"> A failed gate returns the exact error to the responsible agent. After three failures the job stops and is flagged for a person. This bounds cost and prevents endless self-correction.</w:t>
-      </w:r>
-    </w:p>
-    <w:p>
-      <w:pPr>
-        <w:pStyle w:val="ListNumber"/>
-      </w:pPr>
-      <w:r>
-        <w:rPr>
-          <w:b/>
-        </w:rPr>
-        <w:t>Shared artifacts, not chat.</w:t>
-      </w:r>
-      <w:r>
-        <w:t xml:space="preserve"> Agents communicate through </w:t>
-      </w:r>
-      <w:r>
-        <w:rPr>
-          <w:rFonts w:ascii="Consolas" w:hAnsi="Consolas"/>
-          <w:sz w:val="19"/>
-        </w:rPr>
-        <w:t>lesson.yaml</w:t>
-      </w:r>
-      <w:r>
-        <w:t>, the mathematics module, the facts dictionary and the timing records. This is what keeps story, simulation and video consistent, and it makes every hand-off inspectable.</w:t>
-      </w:r>
-    </w:p>
-    <w:p>
-      <w:pPr>
-        <w:pStyle w:val="ListNumber"/>
-      </w:pPr>
-      <w:r>
-        <w:rPr>
-          <w:b/>
-        </w:rPr>
-        <w:t>One human checkpoint.</w:t>
-      </w:r>
-      <w:r>
-        <w:t xml:space="preserve"> The storyboard stops for the founder's sign-off before the expensive animation and render stages. Six lessons were approved this way; the first pilot was rejected once (story and theming) and re-planned before any animation was rendered.</w:t>
-      </w:r>
-    </w:p>
-    <w:p>
-      <w:pPr>
-        <w:pStyle w:val="ListNumber"/>
-      </w:pPr>
-      <w:r>
-        <w:rPr>
-          <w:b/>
-        </w:rPr>
-        <w:t>Budget and reuse.</w:t>
-      </w:r>
-      <w:r>
-        <w:t xml:space="preserve"> Each job has a token and render-minute budget. A verified mathematics module is reused across learners: the same mathematics can be given a different story, example and depth, which is what makes personalisation affordable.</w:t>
-      </w:r>
-    </w:p>
-    <w:p>
-      <w:pPr>
-        <w:pStyle w:val="Heading2"/>
-      </w:pPr>
-      <w:r>
-        <w:t>6.3 Timing contract between narration and animation</w:t>
-      </w:r>
-    </w:p>
-    <w:p>
-      <w:r>
-        <w:t xml:space="preserve">The sync engine gives every beat a spoken window. Narration is synthesised per chapter, word timings recover the beat boundaries, and each Manim scene declares </w:t>
-      </w:r>
-      <w:r>
-        <w:rPr>
-          <w:rFonts w:ascii="Consolas" w:hAnsi="Consolas"/>
-          <w:sz w:val="19"/>
-        </w:rPr>
-        <w:t>with self.beat(id)</w:t>
-      </w:r>
-      <w:r>
-        <w:t xml:space="preserve"> blocks that may </w:t>
-      </w:r>
-      <w:r>
-        <w:rPr>
-          <w:rFonts w:ascii="Consolas" w:hAnsi="Consolas"/>
-          <w:sz w:val="19"/>
-        </w:rPr>
-        <w:t>wait_for("phrase")</w:t>
-      </w:r>
-      <w:r>
-        <w:t xml:space="preserve"> on a cue word. At assembly, audio is sliced per beat (</w:t>
-      </w:r>
-      <w:r>
-        <w:rPr>
-          <w:rFonts w:ascii="Consolas" w:hAnsi="Consolas"/>
-          <w:sz w:val="19"/>
-        </w:rPr>
-        <w:t>atrim</w:t>
-      </w:r>
-      <w:r>
-        <w:t xml:space="preserve"> + </w:t>
-      </w:r>
-      <w:r>
-        <w:rPr>
-          <w:rFonts w:ascii="Consolas" w:hAnsi="Consolas"/>
-          <w:sz w:val="19"/>
-        </w:rPr>
-        <w:t>adelay</w:t>
-      </w:r>
-      <w:r>
-        <w:t>), so a small animation overrun is absorbed rather than drifting through the rest of the video. The build records the actual start of every beat so the Visual Critic and the overrun gate check real frames, not estimates.</w:t>
+        <w:t>A rule-based orchestrator moves every lesson through fixed verification gates: the mathematics tests must pass, the lesson file must validate with every placeholder resolved and every equation's test present, the founder must approve the storyboard, the animation must fit its narration, and every frame must pass visual review. A failed gate returns the exact error to the responsible role; after three failures the job stops for a person. The gates are deterministic programs, so a passing lesson is reproducible. The detailed job state machine, control rules and the timing contract between narration and animation are documented in the private repository.</w:t>
       </w:r>
     </w:p>
     <w:p>
@@ -5997,7 +3703,7 @@
         <w:drawing>
           <wp:inline xmlns:a="http://schemas.openxmlformats.org/drawingml/2006/main" xmlns:pic="http://schemas.openxmlformats.org/drawingml/2006/picture">
             <wp:extent cx="5940000" cy="2368466"/>
-            <wp:docPr id="3" name="Picture 3"/>
+            <wp:docPr id="2" name="Picture 2"/>
             <wp:cNvGraphicFramePr>
               <a:graphicFrameLocks noChangeAspect="1"/>
             </wp:cNvGraphicFramePr>
@@ -6009,7 +3715,7 @@
                     <pic:cNvPicPr/>
                   </pic:nvPicPr>
                   <pic:blipFill>
-                    <a:blip r:embed="rId11"/>
+                    <a:blip r:embed="rId10"/>
                     <a:stretch>
                       <a:fillRect/>
                     </a:stretch>
@@ -6124,7 +3830,7 @@
         <w:drawing>
           <wp:inline xmlns:a="http://schemas.openxmlformats.org/drawingml/2006/main" xmlns:pic="http://schemas.openxmlformats.org/drawingml/2006/picture">
             <wp:extent cx="5940000" cy="7775778"/>
-            <wp:docPr id="4" name="Picture 4"/>
+            <wp:docPr id="3" name="Picture 3"/>
             <wp:cNvGraphicFramePr>
               <a:graphicFrameLocks noChangeAspect="1"/>
             </wp:cNvGraphicFramePr>
@@ -6136,7 +3842,7 @@
                     <pic:cNvPicPr/>
                   </pic:nvPicPr>
                   <pic:blipFill>
-                    <a:blip r:embed="rId12"/>
+                    <a:blip r:embed="rId11"/>
                     <a:stretch>
                       <a:fillRect/>
                     </a:stretch>
@@ -6363,7 +4069,7 @@
               <w:rPr>
                 <w:sz w:val="17"/>
               </w:rPr>
-              <w:t>Narration, sync engine, snapshot QA, renderer, assembly, branding overlay, captions, chapters, SEO pack</w:t>
+              <w:t>Video production pipeline: narration, animation, rendering, captions, chapters, SEO pack</w:t>
             </w:r>
           </w:p>
         </w:tc>
@@ -6391,20 +4097,7 @@
               <w:rPr>
                 <w:sz w:val="17"/>
               </w:rPr>
-              <w:t xml:space="preserve"> (</w:t>
-            </w:r>
-            <w:r>
-              <w:rPr>
-                <w:rFonts w:ascii="Consolas" w:hAnsi="Consolas"/>
-                <w:sz w:val="17"/>
-              </w:rPr>
-              <w:t>src/avirmath/video/</w:t>
-            </w:r>
-            <w:r>
-              <w:rPr>
-                <w:sz w:val="17"/>
-              </w:rPr>
-              <w:t>).</w:t>
+              <w:t xml:space="preserve"> (private repository).</w:t>
             </w:r>
           </w:p>
         </w:tc>
@@ -6455,33 +4148,7 @@
               <w:rPr>
                 <w:sz w:val="17"/>
               </w:rPr>
-              <w:t xml:space="preserve"> (</w:t>
-            </w:r>
-            <w:r>
-              <w:rPr>
-                <w:rFonts w:ascii="Consolas" w:hAnsi="Consolas"/>
-                <w:sz w:val="17"/>
-              </w:rPr>
-              <w:t>web/build_site.py</w:t>
-            </w:r>
-            <w:r>
-              <w:rPr>
-                <w:sz w:val="17"/>
-              </w:rPr>
-              <w:t xml:space="preserve"> → </w:t>
-            </w:r>
-            <w:r>
-              <w:rPr>
-                <w:rFonts w:ascii="Consolas" w:hAnsi="Consolas"/>
-                <w:sz w:val="17"/>
-              </w:rPr>
-              <w:t>web/site/</w:t>
-            </w:r>
-            <w:r>
-              <w:rPr>
-                <w:sz w:val="17"/>
-              </w:rPr>
-              <w:t>).</w:t>
+              <w:t xml:space="preserve"> (private repository; the generated site is public).</w:t>
             </w:r>
           </w:p>
         </w:tc>
@@ -6708,15 +4375,14 @@
         <w:tblLook w:firstColumn="1" w:firstRow="1" w:lastColumn="0" w:lastRow="0" w:noHBand="0" w:noVBand="1" w:val="04A0"/>
       </w:tblPr>
       <w:tblGrid>
-        <w:gridCol w:w="2436"/>
-        <w:gridCol w:w="2436"/>
-        <w:gridCol w:w="2436"/>
-        <w:gridCol w:w="2436"/>
+        <w:gridCol w:w="3249"/>
+        <w:gridCol w:w="3249"/>
+        <w:gridCol w:w="3249"/>
       </w:tblGrid>
       <w:tr>
         <w:tc>
           <w:tcPr>
-            <w:tcW w:type="dxa" w:w="2436"/>
+            <w:tcW w:type="dxa" w:w="3249"/>
             <w:shd w:val="clear" w:color="auto" w:fill="E5E7EB"/>
           </w:tcPr>
           <w:p>
@@ -6740,7 +4406,7 @@
         </w:tc>
         <w:tc>
           <w:tcPr>
-            <w:tcW w:type="dxa" w:w="2436"/>
+            <w:tcW w:type="dxa" w:w="3249"/>
             <w:shd w:val="clear" w:color="auto" w:fill="E5E7EB"/>
           </w:tcPr>
           <w:p>
@@ -6764,7 +4430,7 @@
         </w:tc>
         <w:tc>
           <w:tcPr>
-            <w:tcW w:type="dxa" w:w="2436"/>
+            <w:tcW w:type="dxa" w:w="3249"/>
             <w:shd w:val="clear" w:color="auto" w:fill="E5E7EB"/>
           </w:tcPr>
           <w:p>
@@ -6786,10 +4452,11 @@
             </w:r>
           </w:p>
         </w:tc>
+      </w:tr>
+      <w:tr>
         <w:tc>
           <w:tcPr>
-            <w:tcW w:type="dxa" w:w="2436"/>
-            <w:shd w:val="clear" w:color="auto" w:fill="E5E7EB"/>
+            <w:tcW w:type="dxa" w:w="3249"/>
           </w:tcPr>
           <w:p>
             <w:pPr>
@@ -6797,16 +4464,70 @@
             </w:pPr>
             <w:r>
               <w:rPr>
-                <w:b/>
-                <w:sz w:val="17"/>
-              </w:rPr>
-            </w:r>
-            <w:r>
-              <w:rPr>
-                <w:b/>
-                <w:sz w:val="17"/>
-              </w:rPr>
-              <w:t>Output</w:t>
+                <w:sz w:val="17"/>
+              </w:rPr>
+            </w:r>
+            <w:r>
+              <w:rPr>
+                <w:sz w:val="17"/>
+              </w:rPr>
+              <w:t>1</w:t>
+            </w:r>
+          </w:p>
+        </w:tc>
+        <w:tc>
+          <w:tcPr>
+            <w:tcW w:type="dxa" w:w="3249"/>
+          </w:tcPr>
+          <w:p>
+            <w:pPr>
+              <w:spacing w:after="20"/>
+            </w:pPr>
+            <w:r>
+              <w:rPr>
+                <w:sz w:val="17"/>
+              </w:rPr>
+            </w:r>
+            <w:r>
+              <w:rPr>
+                <w:sz w:val="17"/>
+              </w:rPr>
+              <w:t>Gradient descent (Cauchy, 1847 → Stanford, 1960 → today)</w:t>
+            </w:r>
+          </w:p>
+        </w:tc>
+        <w:tc>
+          <w:tcPr>
+            <w:tcW w:type="dxa" w:w="3249"/>
+          </w:tcPr>
+          <w:p>
+            <w:pPr>
+              <w:spacing w:after="20"/>
+            </w:pPr>
+            <w:r>
+              <w:rPr>
+                <w:sz w:val="17"/>
+              </w:rPr>
+            </w:r>
+            <w:r>
+              <w:rPr>
+                <w:rFonts w:ascii="Consolas" w:hAnsi="Consolas"/>
+                <w:sz w:val="17"/>
+              </w:rPr>
+              <w:t>gradient_descent.py</w:t>
+            </w:r>
+            <w:r>
+              <w:rPr>
+                <w:sz w:val="17"/>
+              </w:rPr>
+              <w:t xml:space="preserve">, </w:t>
+            </w:r>
+            <w:r>
+              <w:rPr>
+                <w:rFonts w:ascii="Consolas" w:hAnsi="Consolas"/>
+                <w:sz w:val="17"/>
+              </w:rPr>
+              <w:t>adaptive_filter.py</w:t>
             </w:r>
           </w:p>
         </w:tc>
@@ -6814,7 +4535,7 @@
       <w:tr>
         <w:tc>
           <w:tcPr>
-            <w:tcW w:type="dxa" w:w="2436"/>
+            <w:tcW w:type="dxa" w:w="3249"/>
           </w:tcPr>
           <w:p>
             <w:pPr>
@@ -6829,13 +4550,13 @@
               <w:rPr>
                 <w:sz w:val="17"/>
               </w:rPr>
-              <w:t>1</w:t>
+              <w:t>2</w:t>
             </w:r>
           </w:p>
         </w:tc>
         <w:tc>
           <w:tcPr>
-            <w:tcW w:type="dxa" w:w="2436"/>
+            <w:tcW w:type="dxa" w:w="3249"/>
           </w:tcPr>
           <w:p>
             <w:pPr>
@@ -6850,13 +4571,13 @@
               <w:rPr>
                 <w:sz w:val="17"/>
               </w:rPr>
-              <w:t>Gradient descent (Cauchy, 1847 → Stanford, 1960 → today)</w:t>
+              <w:t>Backpropagation</w:t>
             </w:r>
           </w:p>
         </w:tc>
         <w:tc>
           <w:tcPr>
-            <w:tcW w:type="dxa" w:w="2436"/>
+            <w:tcW w:type="dxa" w:w="3249"/>
           </w:tcPr>
           <w:p>
             <w:pPr>
@@ -6872,42 +4593,7 @@
                 <w:rFonts w:ascii="Consolas" w:hAnsi="Consolas"/>
                 <w:sz w:val="17"/>
               </w:rPr>
-              <w:t>gradient_descent.py</w:t>
-            </w:r>
-            <w:r>
-              <w:rPr>
-                <w:sz w:val="17"/>
-              </w:rPr>
-              <w:t xml:space="preserve">, </w:t>
-            </w:r>
-            <w:r>
-              <w:rPr>
-                <w:rFonts w:ascii="Consolas" w:hAnsi="Consolas"/>
-                <w:sz w:val="17"/>
-              </w:rPr>
-              <w:t>adaptive_filter.py</w:t>
-            </w:r>
-          </w:p>
-        </w:tc>
-        <w:tc>
-          <w:tcPr>
-            <w:tcW w:type="dxa" w:w="2436"/>
-          </w:tcPr>
-          <w:p>
-            <w:pPr>
-              <w:spacing w:after="20"/>
-            </w:pPr>
-            <w:r>
-              <w:rPr>
-                <w:sz w:val="17"/>
-              </w:rPr>
-            </w:r>
-            <w:r>
-              <w:rPr>
-                <w:rFonts w:ascii="Consolas" w:hAnsi="Consolas"/>
-                <w:sz w:val="17"/>
-              </w:rPr>
-              <w:t>output/gradient-descent/v2-female-voice-logo/</w:t>
+              <w:t>backprop.py</w:t>
             </w:r>
           </w:p>
         </w:tc>
@@ -6915,7 +4601,7 @@
       <w:tr>
         <w:tc>
           <w:tcPr>
-            <w:tcW w:type="dxa" w:w="2436"/>
+            <w:tcW w:type="dxa" w:w="3249"/>
           </w:tcPr>
           <w:p>
             <w:pPr>
@@ -6930,13 +4616,13 @@
               <w:rPr>
                 <w:sz w:val="17"/>
               </w:rPr>
-              <w:t>2</w:t>
+              <w:t>3</w:t>
             </w:r>
           </w:p>
         </w:tc>
         <w:tc>
           <w:tcPr>
-            <w:tcW w:type="dxa" w:w="2436"/>
+            <w:tcW w:type="dxa" w:w="3249"/>
           </w:tcPr>
           <w:p>
             <w:pPr>
@@ -6951,13 +4637,13 @@
               <w:rPr>
                 <w:sz w:val="17"/>
               </w:rPr>
-              <w:t>Backpropagation</w:t>
+              <w:t>Vectors and the dot product</w:t>
             </w:r>
           </w:p>
         </w:tc>
         <w:tc>
           <w:tcPr>
-            <w:tcW w:type="dxa" w:w="2436"/>
+            <w:tcW w:type="dxa" w:w="3249"/>
           </w:tcPr>
           <w:p>
             <w:pPr>
@@ -6973,29 +4659,7 @@
                 <w:rFonts w:ascii="Consolas" w:hAnsi="Consolas"/>
                 <w:sz w:val="17"/>
               </w:rPr>
-              <w:t>backprop.py</w:t>
-            </w:r>
-          </w:p>
-        </w:tc>
-        <w:tc>
-          <w:tcPr>
-            <w:tcW w:type="dxa" w:w="2436"/>
-          </w:tcPr>
-          <w:p>
-            <w:pPr>
-              <w:spacing w:after="20"/>
-            </w:pPr>
-            <w:r>
-              <w:rPr>
-                <w:sz w:val="17"/>
-              </w:rPr>
-            </w:r>
-            <w:r>
-              <w:rPr>
-                <w:rFonts w:ascii="Consolas" w:hAnsi="Consolas"/>
-                <w:sz w:val="17"/>
-              </w:rPr>
-              <w:t>output/backpropagation/v1/</w:t>
+              <w:t>vectors.py</w:t>
             </w:r>
           </w:p>
         </w:tc>
@@ -7003,7 +4667,7 @@
       <w:tr>
         <w:tc>
           <w:tcPr>
-            <w:tcW w:type="dxa" w:w="2436"/>
+            <w:tcW w:type="dxa" w:w="3249"/>
           </w:tcPr>
           <w:p>
             <w:pPr>
@@ -7018,13 +4682,13 @@
               <w:rPr>
                 <w:sz w:val="17"/>
               </w:rPr>
-              <w:t>3</w:t>
+              <w:t>4</w:t>
             </w:r>
           </w:p>
         </w:tc>
         <w:tc>
           <w:tcPr>
-            <w:tcW w:type="dxa" w:w="2436"/>
+            <w:tcW w:type="dxa" w:w="3249"/>
           </w:tcPr>
           <w:p>
             <w:pPr>
@@ -7039,13 +4703,13 @@
               <w:rPr>
                 <w:sz w:val="17"/>
               </w:rPr>
-              <w:t>Vectors and the dot product</w:t>
+              <w:t>Matrices as transformations</w:t>
             </w:r>
           </w:p>
         </w:tc>
         <w:tc>
           <w:tcPr>
-            <w:tcW w:type="dxa" w:w="2436"/>
+            <w:tcW w:type="dxa" w:w="3249"/>
           </w:tcPr>
           <w:p>
             <w:pPr>
@@ -7061,29 +4725,7 @@
                 <w:rFonts w:ascii="Consolas" w:hAnsi="Consolas"/>
                 <w:sz w:val="17"/>
               </w:rPr>
-              <w:t>vectors.py</w:t>
-            </w:r>
-          </w:p>
-        </w:tc>
-        <w:tc>
-          <w:tcPr>
-            <w:tcW w:type="dxa" w:w="2436"/>
-          </w:tcPr>
-          <w:p>
-            <w:pPr>
-              <w:spacing w:after="20"/>
-            </w:pPr>
-            <w:r>
-              <w:rPr>
-                <w:sz w:val="17"/>
-              </w:rPr>
-            </w:r>
-            <w:r>
-              <w:rPr>
-                <w:rFonts w:ascii="Consolas" w:hAnsi="Consolas"/>
-                <w:sz w:val="17"/>
-              </w:rPr>
-              <w:t>output/vectors-dot-product/v1/</w:t>
+              <w:t>matrices.py</w:t>
             </w:r>
           </w:p>
         </w:tc>
@@ -7091,7 +4733,7 @@
       <w:tr>
         <w:tc>
           <w:tcPr>
-            <w:tcW w:type="dxa" w:w="2436"/>
+            <w:tcW w:type="dxa" w:w="3249"/>
           </w:tcPr>
           <w:p>
             <w:pPr>
@@ -7106,13 +4748,13 @@
               <w:rPr>
                 <w:sz w:val="17"/>
               </w:rPr>
-              <w:t>4</w:t>
+              <w:t>5</w:t>
             </w:r>
           </w:p>
         </w:tc>
         <w:tc>
           <w:tcPr>
-            <w:tcW w:type="dxa" w:w="2436"/>
+            <w:tcW w:type="dxa" w:w="3249"/>
           </w:tcPr>
           <w:p>
             <w:pPr>
@@ -7127,13 +4769,13 @@
               <w:rPr>
                 <w:sz w:val="17"/>
               </w:rPr>
-              <w:t>Matrices as transformations</w:t>
+              <w:t>Softmax and cross-entropy</w:t>
             </w:r>
           </w:p>
         </w:tc>
         <w:tc>
           <w:tcPr>
-            <w:tcW w:type="dxa" w:w="2436"/>
+            <w:tcW w:type="dxa" w:w="3249"/>
           </w:tcPr>
           <w:p>
             <w:pPr>
@@ -7149,29 +4791,7 @@
                 <w:rFonts w:ascii="Consolas" w:hAnsi="Consolas"/>
                 <w:sz w:val="17"/>
               </w:rPr>
-              <w:t>matrices.py</w:t>
-            </w:r>
-          </w:p>
-        </w:tc>
-        <w:tc>
-          <w:tcPr>
-            <w:tcW w:type="dxa" w:w="2436"/>
-          </w:tcPr>
-          <w:p>
-            <w:pPr>
-              <w:spacing w:after="20"/>
-            </w:pPr>
-            <w:r>
-              <w:rPr>
-                <w:sz w:val="17"/>
-              </w:rPr>
-            </w:r>
-            <w:r>
-              <w:rPr>
-                <w:rFonts w:ascii="Consolas" w:hAnsi="Consolas"/>
-                <w:sz w:val="17"/>
-              </w:rPr>
-              <w:t>output/matrices-transformations/v1/</w:t>
+              <w:t>softmax.py</w:t>
             </w:r>
           </w:p>
         </w:tc>
@@ -7179,7 +4799,7 @@
       <w:tr>
         <w:tc>
           <w:tcPr>
-            <w:tcW w:type="dxa" w:w="2436"/>
+            <w:tcW w:type="dxa" w:w="3249"/>
           </w:tcPr>
           <w:p>
             <w:pPr>
@@ -7194,13 +4814,13 @@
               <w:rPr>
                 <w:sz w:val="17"/>
               </w:rPr>
-              <w:t>5</w:t>
+              <w:t>6</w:t>
             </w:r>
           </w:p>
         </w:tc>
         <w:tc>
           <w:tcPr>
-            <w:tcW w:type="dxa" w:w="2436"/>
+            <w:tcW w:type="dxa" w:w="3249"/>
           </w:tcPr>
           <w:p>
             <w:pPr>
@@ -7215,13 +4835,13 @@
               <w:rPr>
                 <w:sz w:val="17"/>
               </w:rPr>
-              <w:t>Softmax and cross-entropy</w:t>
+              <w:t>Linear and logistic regression</w:t>
             </w:r>
           </w:p>
         </w:tc>
         <w:tc>
           <w:tcPr>
-            <w:tcW w:type="dxa" w:w="2436"/>
+            <w:tcW w:type="dxa" w:w="3249"/>
           </w:tcPr>
           <w:p>
             <w:pPr>
@@ -7237,117 +4857,7 @@
                 <w:rFonts w:ascii="Consolas" w:hAnsi="Consolas"/>
                 <w:sz w:val="17"/>
               </w:rPr>
-              <w:t>softmax.py</w:t>
-            </w:r>
-          </w:p>
-        </w:tc>
-        <w:tc>
-          <w:tcPr>
-            <w:tcW w:type="dxa" w:w="2436"/>
-          </w:tcPr>
-          <w:p>
-            <w:pPr>
-              <w:spacing w:after="20"/>
-            </w:pPr>
-            <w:r>
-              <w:rPr>
-                <w:sz w:val="17"/>
-              </w:rPr>
-            </w:r>
-            <w:r>
-              <w:rPr>
-                <w:rFonts w:ascii="Consolas" w:hAnsi="Consolas"/>
-                <w:sz w:val="17"/>
-              </w:rPr>
-              <w:t>output/softmax-cross-entropy/v1/</w:t>
-            </w:r>
-          </w:p>
-        </w:tc>
-      </w:tr>
-      <w:tr>
-        <w:tc>
-          <w:tcPr>
-            <w:tcW w:type="dxa" w:w="2436"/>
-          </w:tcPr>
-          <w:p>
-            <w:pPr>
-              <w:spacing w:after="20"/>
-            </w:pPr>
-            <w:r>
-              <w:rPr>
-                <w:sz w:val="17"/>
-              </w:rPr>
-            </w:r>
-            <w:r>
-              <w:rPr>
-                <w:sz w:val="17"/>
-              </w:rPr>
-              <w:t>6</w:t>
-            </w:r>
-          </w:p>
-        </w:tc>
-        <w:tc>
-          <w:tcPr>
-            <w:tcW w:type="dxa" w:w="2436"/>
-          </w:tcPr>
-          <w:p>
-            <w:pPr>
-              <w:spacing w:after="20"/>
-            </w:pPr>
-            <w:r>
-              <w:rPr>
-                <w:sz w:val="17"/>
-              </w:rPr>
-            </w:r>
-            <w:r>
-              <w:rPr>
-                <w:sz w:val="17"/>
-              </w:rPr>
-              <w:t>Linear and logistic regression</w:t>
-            </w:r>
-          </w:p>
-        </w:tc>
-        <w:tc>
-          <w:tcPr>
-            <w:tcW w:type="dxa" w:w="2436"/>
-          </w:tcPr>
-          <w:p>
-            <w:pPr>
-              <w:spacing w:after="20"/>
-            </w:pPr>
-            <w:r>
-              <w:rPr>
-                <w:sz w:val="17"/>
-              </w:rPr>
-            </w:r>
-            <w:r>
-              <w:rPr>
-                <w:rFonts w:ascii="Consolas" w:hAnsi="Consolas"/>
-                <w:sz w:val="17"/>
-              </w:rPr>
               <w:t>regression.py</w:t>
-            </w:r>
-          </w:p>
-        </w:tc>
-        <w:tc>
-          <w:tcPr>
-            <w:tcW w:type="dxa" w:w="2436"/>
-          </w:tcPr>
-          <w:p>
-            <w:pPr>
-              <w:spacing w:after="20"/>
-            </w:pPr>
-            <w:r>
-              <w:rPr>
-                <w:sz w:val="17"/>
-              </w:rPr>
-            </w:r>
-            <w:r>
-              <w:rPr>
-                <w:rFonts w:ascii="Consolas" w:hAnsi="Consolas"/>
-                <w:sz w:val="17"/>
-              </w:rPr>
-              <w:t>output/linear-logistic-regression/v1/</w:t>
             </w:r>
           </w:p>
         </w:tc>
@@ -7356,7 +4866,17 @@
     <w:p/>
     <w:p>
       <w:r>
-        <w:t>Each output folder contains the 720p24 video, SRT and VTT captions, a chapter file and the SEO/AEO/GEO pack.</w:t>
+        <w:t xml:space="preserve">Each lesson ships as a 720p video with SRT and VTT captions, a chapter file and an SEO/AEO/GEO pack (captions and packs are in </w:t>
+      </w:r>
+      <w:r>
+        <w:rPr>
+          <w:rFonts w:ascii="Consolas" w:hAnsi="Consolas"/>
+          <w:sz w:val="19"/>
+        </w:rPr>
+        <w:t>results/</w:t>
+      </w:r>
+      <w:r>
+        <w:t>).</w:t>
       </w:r>
     </w:p>
     <w:p>
@@ -7368,6 +4888,11 @@
       </w:r>
     </w:p>
     <w:p>
+      <w:r>
+        <w:t>This public repository:</w:t>
+      </w:r>
+    </w:p>
+    <w:p>
       <w:pPr>
         <w:ind w:left="283"/>
       </w:pPr>
@@ -7376,44 +4901,32 @@
           <w:rFonts w:ascii="Consolas" w:hAnsi="Consolas"/>
           <w:sz w:val="17"/>
         </w:rPr>
-        <w:t>Avirmath AI/</w:t>
+        <w:t>avirmath-ai-showcase/</w:t>
         <w:br/>
-        <w:t>├─ skills/avirmathai/              house rules, pedagogy and Manim references, scene template</w:t>
+        <w:t>├─ README.md, RESULTS.md, DECISIONS.md, DATASETS.md</w:t>
         <w:br/>
-        <w:t>├─ ARCHITECTURE.md                 short agent design note (superseded by this document)</w:t>
+        <w:t>├─ LICENSE (Apache-2.0, code) · LICENSE-CONTENT.md (CC BY-NC 4.0, lessons)</w:t>
         <w:br/>
-        <w:t>├─ PLAN.md                         product plan and phases</w:t>
+        <w:t>├─ docs/                           this document, the plain-language explainer, figures</w:t>
         <w:br/>
-        <w:t>├─ branding.yaml                   logo and handle placement rules</w:t>
+        <w:t>├─ lessons/&lt;id&gt;/lesson.yaml        one lesson file per concept; CATALOG.md lists the 21 topics</w:t>
         <w:br/>
-        <w:t>├─ design-system/avirmath-ai/      design tokens from the ui-ux-pro-max skill</w:t>
+        <w:t>├─ src/avirmath/mathcore/          tested mathematics, one module per concept, lesson_facts()</w:t>
         <w:br/>
-        <w:t>├─ docs/</w:t>
-        <w:br/>
-        <w:t>│  ├─ AVIRMATH_AI_Architecture.md  this document</w:t>
-        <w:br/>
-        <w:t>│  └─ figures/                     make_figures.py and fig1–fig3 (pdf, svg, png)</w:t>
-        <w:br/>
-        <w:t>├─ lessons/&lt;id&gt;/lesson.yaml        one lesson file per concept; CATALOG.md lists 21 planned topics</w:t>
-        <w:br/>
-        <w:t>├─ src/avirmath/</w:t>
-        <w:br/>
-        <w:t>│  ├─ mathcore/                    tested mathematics, one module per concept</w:t>
-        <w:br/>
-        <w:t>│  ├─ lesson/                      schema.json and loader (validation, facts binding)</w:t>
-        <w:br/>
-        <w:t>│  └─ video/                       narrate, build, branding, seo, style, scenes/&lt;id&gt;.py</w:t>
+        <w:t>├─ src/avirmath/lesson/            schema.json and loader (validation, facts binding, checked_by)</w:t>
         <w:br/>
         <w:t>├─ tests/                          125 pytest tests</w:t>
         <w:br/>
-        <w:t>├─ web/build_site.py → web/site/   static site (home + lessons + media)</w:t>
+        <w:t>├─ data/                           the three UCI datasets modelled on screen</w:t>
         <w:br/>
-        <w:t>└─ output/&lt;id&gt;/&lt;version&gt;/          published videos and packs</w:t>
+        <w:t>├─ results/&lt;id&gt;/                   captions, chapters, descriptions and AI summaries per lesson</w:t>
+        <w:br/>
+        <w:t>└─ thumbnails/                     published video thumbnails</w:t>
       </w:r>
     </w:p>
     <w:p>
       <w:r>
-        <w:t>Project source (Python, HTML, JavaScript, excluding generated site) is about 7,000 lines.</w:t>
+        <w:t>The production pipeline (narration, animation, rendering, site generation) lives in a private repository.</w:t>
       </w:r>
     </w:p>
     <w:p>
@@ -7426,7 +4939,7 @@
     </w:p>
     <w:p>
       <w:r>
-        <w:t>All commands run from the project root with the project's own interpreter.</w:t>
+        <w:t>From this repository:</w:t>
       </w:r>
     </w:p>
     <w:p>
@@ -7438,48 +4951,36 @@
           <w:rFonts w:ascii="Consolas" w:hAnsi="Consolas"/>
           <w:sz w:val="17"/>
         </w:rPr>
-        <w:t>.venv\Scripts\python.exe -m pytest -q</w:t>
-      </w:r>
-    </w:p>
-    <w:p>
-      <w:pPr>
-        <w:ind w:left="283"/>
-      </w:pPr>
-      <w:r>
-        <w:rPr>
-          <w:rFonts w:ascii="Consolas" w:hAnsi="Consolas"/>
-          <w:sz w:val="17"/>
-        </w:rPr>
-        <w:t>.venv\Scripts\python.exe -m avirmath.video.build gradient-descent --quality sample --snap</w:t>
-      </w:r>
-    </w:p>
-    <w:p>
-      <w:pPr>
-        <w:ind w:left="283"/>
-      </w:pPr>
-      <w:r>
-        <w:rPr>
-          <w:rFonts w:ascii="Consolas" w:hAnsi="Consolas"/>
-          <w:sz w:val="17"/>
-        </w:rPr>
-        <w:t>.venv\Scripts\python.exe web\build_site.py</w:t>
-      </w:r>
-    </w:p>
-    <w:p>
-      <w:pPr>
-        <w:ind w:left="283"/>
-      </w:pPr>
-      <w:r>
-        <w:rPr>
-          <w:rFonts w:ascii="Consolas" w:hAnsi="Consolas"/>
-          <w:sz w:val="17"/>
-        </w:rPr>
-        <w:t>.venv\Scripts\python.exe docs\figures\make_figures.py</w:t>
+        <w:t>python -m venv .venv</w:t>
+        <w:br/>
+        <w:t>.venv/Scripts/pip install -e ".[test]"</w:t>
+        <w:br/>
+        <w:t>python -m pytest -q</w:t>
       </w:r>
     </w:p>
     <w:p>
       <w:r>
-        <w:t>The figures are regenerated from code, so they can be revised for a journal's style requirements (size, font, greyscale) without redrawing.</w:t>
+        <w:t xml:space="preserve">Every number quoted in a lesson can be regenerated with </w:t>
+      </w:r>
+      <w:r>
+        <w:rPr>
+          <w:rFonts w:ascii="Consolas" w:hAnsi="Consolas"/>
+          <w:sz w:val="19"/>
+        </w:rPr>
+        <w:t>lesson_facts()</w:t>
+      </w:r>
+      <w:r>
+        <w:t xml:space="preserve"> from the corresponding module, and every lesson file can be validated with </w:t>
+      </w:r>
+      <w:r>
+        <w:rPr>
+          <w:rFonts w:ascii="Consolas" w:hAnsi="Consolas"/>
+          <w:sz w:val="19"/>
+        </w:rPr>
+        <w:t>avirmath.lesson.loader.load_lesson</w:t>
+      </w:r>
+      <w:r>
+        <w:t>. The figures are generated from code, so they can be revised for a journal's style requirements (size, font, greyscale) without redrawing.</w:t>
       </w:r>
     </w:p>
     <w:sectPr>

</xml_diff>